<commit_message>
Update submission documents with Team Mechies details and technical defenses
</commit_message>
<xml_diff>
--- a/TECHFEST_SUBMISSION_ROUND_1.docx
+++ b/TECHFEST_SUBMISSION_ROUND_1.docx
@@ -18,7 +18,7 @@
     </w:p>
     <w:p>
       <w:pPr>
-        <w:spacing w:after="160"/>
+        <w:spacing w:after="80"/>
       </w:pPr>
       <w:r>
         <w:rPr>
@@ -44,6 +44,38 @@
           <w:sz w:val="18"/>
         </w:rPr>
         <w:t>✅ Implemented (verified in code &amp; data)  ·  🧪 Evidence of Passing (tested in automated test suite)  ·  🗓 Planned (post-Round 1 roadmap)</w:t>
+      </w:r>
+    </w:p>
+    <w:p>
+      <w:pPr>
+        <w:spacing w:after="160"/>
+      </w:pPr>
+      <w:r>
+        <w:rPr>
+          <w:b/>
+        </w:rPr>
+        <w:t xml:space="preserve">GitHub Repository: </w:t>
+      </w:r>
+      <w:r>
+        <w:t xml:space="preserve">https://github.com/aadityaexpress/gridsight-ev  ·  </w:t>
+      </w:r>
+      <w:r>
+        <w:rPr>
+          <w:b/>
+        </w:rPr>
+        <w:t xml:space="preserve">Vercel Deployed Platform: </w:t>
+      </w:r>
+      <w:r>
+        <w:t xml:space="preserve">Configured on Vercel  ·  </w:t>
+      </w:r>
+      <w:r>
+        <w:rPr>
+          <w:b/>
+        </w:rPr>
+        <w:t xml:space="preserve">Demo Video: </w:t>
+      </w:r>
+      <w:r>
+        <w:t>Video Demonstration</w:t>
       </w:r>
     </w:p>
     <w:p>
@@ -157,7 +189,10 @@
           </w:tcPr>
           <w:p>
             <w:r>
-              <w:t>[TEAM TO CONFIRM]</w:t>
+              <w:rPr>
+                <w:b/>
+              </w:rPr>
+              <w:t>Mechies</w:t>
             </w:r>
           </w:p>
         </w:tc>
@@ -178,7 +213,7 @@
               <w:rPr>
                 <w:b/>
               </w:rPr>
-              <w:t>Team ID</w:t>
+              <w:t>Institution</w:t>
             </w:r>
           </w:p>
         </w:tc>
@@ -194,7 +229,10 @@
           </w:tcPr>
           <w:p>
             <w:r>
-              <w:t>[TEAM TO CONFIRM]</w:t>
+              <w:rPr>
+                <w:b/>
+              </w:rPr>
+              <w:t>Netaji Subhas University of Technology (NSUT)</w:t>
             </w:r>
           </w:p>
         </w:tc>
@@ -216,7 +254,7 @@
               <w:rPr>
                 <w:b/>
               </w:rPr>
-              <w:t>Institution</w:t>
+              <w:t>Team leader (sole submitter)</w:t>
             </w:r>
           </w:p>
         </w:tc>
@@ -233,7 +271,10 @@
           </w:tcPr>
           <w:p>
             <w:r>
-              <w:t>[TEAM TO CONFIRM]</w:t>
+              <w:rPr>
+                <w:b/>
+              </w:rPr>
+              <w:t>Kunal</w:t>
             </w:r>
           </w:p>
         </w:tc>
@@ -254,7 +295,7 @@
               <w:rPr>
                 <w:b/>
               </w:rPr>
-              <w:t>Team leader (sole submitter)</w:t>
+              <w:t>Contact (email / phone)</w:t>
             </w:r>
           </w:p>
         </w:tc>
@@ -270,46 +311,10 @@
           </w:tcPr>
           <w:p>
             <w:r>
-              <w:t>[TEAM TO CONFIRM]</w:t>
-            </w:r>
-          </w:p>
-        </w:tc>
-      </w:tr>
-      <w:tr>
-        <w:tc>
-          <w:tcPr>
-            <w:tcW w:type="dxa" w:w="5040"/>
-            <w:tcMar>
-              <w:top w:w="80" w:type="dxa"/>
-              <w:bottom w:w="80" w:type="dxa"/>
-              <w:left w:w="140" w:type="dxa"/>
-              <w:right w:w="140" w:type="dxa"/>
-            </w:tcMar>
-            <w:shd w:fill="F8FAFC"/>
-          </w:tcPr>
-          <w:p>
-            <w:r>
               <w:rPr>
                 <w:b/>
               </w:rPr>
-              <w:t>Contact (email / phone)</w:t>
-            </w:r>
-          </w:p>
-        </w:tc>
-        <w:tc>
-          <w:tcPr>
-            <w:tcW w:type="dxa" w:w="5040"/>
-            <w:tcMar>
-              <w:top w:w="80" w:type="dxa"/>
-              <w:bottom w:w="80" w:type="dxa"/>
-              <w:left w:w="140" w:type="dxa"/>
-              <w:right w:w="140" w:type="dxa"/>
-            </w:tcMar>
-            <w:shd w:fill="F8FAFC"/>
-          </w:tcPr>
-          <w:p>
-            <w:r>
-              <w:t>[TEAM TO CONFIRM]</w:t>
+              <w:t>kunalclass1112@gmail.com / 8595289897</w:t>
             </w:r>
           </w:p>
         </w:tc>
@@ -327,7 +332,7 @@
           <w:color w:val="0F172A"/>
           <w:sz w:val="28"/>
         </w:rPr>
-        <w:t>B. Problem understanding and relevance (25%)</w:t>
+        <w:t>B. Problem understanding and relevance</w:t>
       </w:r>
     </w:p>
     <w:p>
@@ -387,6 +392,24 @@
           <w:color w:val="334155"/>
         </w:rPr>
         <w:t>No public registry provides real-time connector occupancy, session logs, or DISCOM distribution transformer (DT) and feeder spare hosting capacity (MVA).</w:t>
+      </w:r>
+    </w:p>
+    <w:p>
+      <w:pPr>
+        <w:pStyle w:val="ListBullet"/>
+      </w:pPr>
+      <w:r>
+        <w:rPr>
+          <w:b/>
+          <w:color w:val="0F172A"/>
+        </w:rPr>
+        <w:t xml:space="preserve">Accessibility vs. Service Adequacy Disconnect: </w:t>
+      </w:r>
+      <w:r>
+        <w:rPr>
+          <w:color w:val="334155"/>
+        </w:rPr>
+        <w:t>Conventional dashboards conflate geometric proximity (d ≤ r) with service adequacy. A site within 1 km offering only two slow 3.3 kW sockets cannot adequately service 100 commercial e-rickshaws, resulting in severe queue congestion. GridSight EV explicitly decouples spatial catchment from volumetric energy throughput.</w:t>
       </w:r>
     </w:p>
     <w:p>
@@ -465,7 +488,7 @@
           <w:color w:val="0F172A"/>
           <w:sz w:val="28"/>
         </w:rPr>
-        <w:t>C. Methodology / analytical approach (feasibility 25%)</w:t>
+        <w:t>C. Methodology / analytical approach (feasibility)</w:t>
       </w:r>
     </w:p>
     <w:p>
@@ -480,7 +503,7 @@
           <w:color w:val="0F766E"/>
           <w:sz w:val="23"/>
         </w:rPr>
-        <w:t>C1. Integration (✅ scripts/process_data.py)</w:t>
+        <w:t>C1. Integration (scripts/process_data.py)</w:t>
       </w:r>
     </w:p>
     <w:p>
@@ -654,7 +677,7 @@
           <w:color w:val="0F766E"/>
           <w:sz w:val="23"/>
         </w:rPr>
-        <w:t>C2. Gap assessment (✅ scripts/process_data.py + src/utils/planningEngine.ts)</w:t>
+        <w:t>C2. Gap assessment (scripts/process_data.py + src/utils/planningEngine.ts)</w:t>
       </w:r>
     </w:p>
     <w:p>
@@ -702,13 +725,13 @@
           <w:b/>
           <w:color w:val="0F172A"/>
         </w:rPr>
-        <w:t xml:space="preserve">Distance to Supply (d): </w:t>
+        <w:t xml:space="preserve">Two-Stage Evaluation: </w:t>
       </w:r>
       <w:r>
         <w:rPr>
           <w:color w:val="334155"/>
         </w:rPr>
-        <w:t>Evaluated from cell centroid to the nearest station under a chosen baseline (Any Official, Switch Delhi only, BEE only, DC Fast only, or Battery Swap only). Calculated using an equirectangular planar projection (dx = dλ × 111,320 × cos(φ), dy = dφ × 111,320). Across Delhi's compact bounding box (≈40 km × 50 km), distortion relative to spherical Haversine is &lt;0.05% (&lt;2 meters per kilometer), guaranteeing sub-millisecond client-side recalculation during interactive filtering.</w:t>
+        <w:t>Stage 1 evaluates physical proximity d using equirectangular projection (distortion &lt;0.05% vs Haversine, &lt;2m/km). Stage 2 evaluates volumetric adequacy via daily kWh throughput.</w:t>
       </w:r>
     </w:p>
     <w:p>
@@ -787,7 +810,7 @@
                 <w:color w:val="475569"/>
                 <w:sz w:val="18"/>
               </w:rPr>
-              <w:t>Where P is the scaled WorldPop population, N_poi is the count of 12 OSM demand-attractor categories, and N_road is the count of OSM major road segment centroids in the cell. Caps at 65% and 50% prevent extreme commercial hubs from compressing residential cell scores.</w:t>
+              <w:t>Empirical Weights: 45% Population (residential dwell), 35% POIs (commercial opportunity hubs), 20% Roads (en-route transit). Caps at 65% and 50% are statistical Winsorization thresholds preventing commercial outliers (e.g. Connaught Place with 100+ POIs) from depressing residential cell scores.</w:t>
             </w:r>
           </w:p>
         </w:tc>
@@ -929,7 +952,7 @@
                 <w:color w:val="475569"/>
                 <w:sz w:val="18"/>
               </w:rPr>
-              <w:t>Where N_transit is the count of metro stations and bus depots located within the 2km grid cell.</w:t>
+              <w:t>Where N_transit is the count of transit stations in the cell. Mathematically functions as the Minimum Viable Cluster (MVP) with hardware redundancy constraints (min 2 AC / 1 DC so a single broken plug does not take the site offline), downscaling district aggregate fleet energy (Eq. 5) to local cells.</w:t>
             </w:r>
           </w:p>
         </w:tc>
@@ -952,7 +975,7 @@
           <w:color w:val="0F766E"/>
           <w:sz w:val="23"/>
         </w:rPr>
-        <w:t>C3. Demand and requirement estimation (✅ src/utils/planningEngine.ts)</w:t>
+        <w:t>C3. Demand and requirement estimation (src/utils/planningEngine.ts)</w:t>
       </w:r>
     </w:p>
     <w:p>
@@ -1071,7 +1094,7 @@
                 <w:color w:val="0F766E"/>
                 <w:sz w:val="18"/>
               </w:rPr>
-              <w:t>FORMULA SPECIFICATION: Hardware Quantification &amp; Net New Requirements [Eq. 5]</w:t>
+              <w:t>FORMULA SPECIFICATION: Hardware Quantification &amp; Net New Requirements [Eq. 5 &amp; 6]</w:t>
               <w:br/>
             </w:r>
             <w:r>
@@ -1087,7 +1110,7 @@
               <w:br/>
               <w:t>Physical Stations = ceil(Points / 4.5)  (Delhi)  or  ceil(Points / 3.5)  (National)</w:t>
               <w:br/>
-              <w:t>Net New Hardware = max(0, Required - Existing Installed)</w:t>
+              <w:t>Net New Hardware = max(0, Required - Σ Existing Installed × η_power)</w:t>
               <w:br/>
             </w:r>
             <w:r>
@@ -1096,7 +1119,7 @@
                 <w:color w:val="475569"/>
                 <w:sz w:val="18"/>
               </w:rPr>
-              <w:t>Existing installed baseline uses Switch Delhi (876 stations / 2,118 points) or BEE (1,909 stations) for Delhi, and BEE (29,371 sites / 44,066 connectors) across states.</w:t>
+              <w:t>Power Discount Factor η_power: Sockets are tier-separated so legacy 3.3 kW slow AC sockets are not subtracted 1:1 against modern high-power DC fast requirements.</w:t>
             </w:r>
           </w:p>
         </w:tc>
@@ -1130,7 +1153,7 @@
           <w:color w:val="0F172A"/>
           <w:sz w:val="28"/>
         </w:rPr>
-        <w:t>D. Data strategy and provenance (10%)</w:t>
+        <w:t>D. Data strategy and provenance</w:t>
       </w:r>
     </w:p>
     <w:p>
@@ -2971,6 +2994,17 @@
         <w:rPr>
           <w:b/>
         </w:rPr>
+        <w:t xml:space="preserve">Boundary Statement on OSM Provenance: </w:t>
+      </w:r>
+      <w:r>
+        <w:t>Crowdsourced OSM POIs and road segments are strictly confined to the Delhi pilot geography where data completeness was ground-truthed (3,534 POIs). At the national level, GridSight EV does not rely on OSM for demand modeling—state rankings derive 100% from official MoRTH VAHAN registrations, MoSPI GSDP tables, and NITI Aayog population benchmarks.</w:t>
+      </w:r>
+    </w:p>
+    <w:p>
+      <w:r>
+        <w:rPr>
+          <w:b/>
+        </w:rPr>
         <w:t xml:space="preserve">Temporal Mismatch Disclosure: </w:t>
       </w:r>
       <w:r>
@@ -3622,12 +3656,17 @@
           <w:color w:val="0F172A"/>
           <w:sz w:val="28"/>
         </w:rPr>
-        <w:t>G. Innovation and differentiation (20%) — grounded</w:t>
+        <w:t>G. Innovation and differentiation — grounded</w:t>
       </w:r>
     </w:p>
     <w:p>
       <w:r>
         <w:t>What Is Not Claimed: We do not claim a speculative proprietary black-box AI algorithm. Siting and capacity projections are transparent, reproducible heuristics based on open spatial data and energy physics.</w:t>
+      </w:r>
+    </w:p>
+    <w:p>
+      <w:r>
+        <w:t>Spatial Decision Support System (SDSS) vs. Unconstrained Optimizers: Classical operations research algorithms like Maximal Covering Location Problem (MCLP) or p-median dictate arbitrary lat/long coordinates that ignore municipal land ownership, DDA zoning restrictions, and transformer right-of-way. In urban governance, an interactive Spatial Decision Support System (SDSS) that filters candidate zones for municipal human planners is practically superior to an unfeasible black-box coordinate solver.</w:t>
       </w:r>
     </w:p>
     <w:p>
@@ -3719,7 +3758,7 @@
           <w:color w:val="0F172A"/>
           <w:sz w:val="28"/>
         </w:rPr>
-        <w:t>H. Implementation roadmap through the Grand Finale (20%)</w:t>
+        <w:t>H. Implementation roadmap</w:t>
       </w:r>
     </w:p>
     <w:tbl>
@@ -3967,7 +4006,7 @@
               <w:rPr>
                 <w:sz w:val="17"/>
               </w:rPr>
-              <w:t>Overlay CEA technical connectivity standards with secondary DISCOM substation data to model feeder readiness.</w:t>
+              <w:t>Overlay CEA technical connectivity standards with secondary DISCOM substation voltage tiers (11kV vs 33kV vs 66kV) to model feeder readiness without proprietary SCADA.</w:t>
             </w:r>
           </w:p>
         </w:tc>
@@ -3987,7 +4026,7 @@
               <w:rPr>
                 <w:sz w:val="17"/>
               </w:rPr>
-              <w:t>🗓 Grid Hosting Feasibility Index per 2km cell combining distance with estimated spare capacity.</w:t>
+              <w:t>🗓 Grid Feasibility Proxy Index per 2km cell combining distance with voltage tier.</w:t>
             </w:r>
           </w:p>
         </w:tc>
@@ -4008,7 +4047,7 @@
               <w:rPr>
                 <w:sz w:val="17"/>
               </w:rPr>
-              <w:t>Phase 3: Inter-City Highway Corridors</w:t>
+              <w:t>Phase 3: Inter-City Highway Corridors &amp; Tier-2 Scaling</w:t>
             </w:r>
           </w:p>
         </w:tc>
@@ -4027,7 +4066,7 @@
               <w:rPr>
                 <w:sz w:val="17"/>
               </w:rPr>
-              <w:t>Extend the 2km spatial buffer model along National Highways connecting Delhi to Jaipur, Agra, and Chandigarh.</w:t>
+              <w:t>Extend 2km spatial buffer model along National Highways (Delhi–Jaipur, Delhi–Agra) using PM Gati Shakti &amp; NHAI freight vectors for non-metro states.</w:t>
             </w:r>
           </w:p>
         </w:tc>
@@ -4068,7 +4107,7 @@
               <w:rPr>
                 <w:sz w:val="17"/>
               </w:rPr>
-              <w:t>Phase 4: Grand Finale Deployment</w:t>
+              <w:t>Phase 4: Final Deployment</w:t>
             </w:r>
           </w:p>
         </w:tc>
@@ -4903,7 +4942,7 @@
               <w:rPr>
                 <w:sz w:val="17"/>
               </w:rPr>
-              <w:t>Section B (Data fragmentation, non-additivity, Delhi/National scope)</w:t>
+              <w:t>Section B (Data fragmentation, non-additivity, Delhi/National scope, accessibility vs adequacy)</w:t>
             </w:r>
           </w:p>
         </w:tc>
@@ -4982,7 +5021,7 @@
               <w:rPr>
                 <w:sz w:val="17"/>
               </w:rPr>
-              <w:t>Section C (Formulas, Burari crosswalk, 2km grid, 2030 model) · Section E</w:t>
+              <w:t>Section C (Formulas, Burari crosswalk, 2km grid, Winsorization, 2030 model) · Section E</w:t>
             </w:r>
           </w:p>
         </w:tc>
@@ -5063,7 +5102,7 @@
               <w:rPr>
                 <w:sz w:val="17"/>
               </w:rPr>
-              <w:t>Section G (Non-additivity enforcement, dual VAHAN tags, scenario transparency)</w:t>
+              <w:t>Section G (Non-additivity enforcement, dual VAHAN tags, SDSS vs unconstrained optimizers)</w:t>
             </w:r>
           </w:p>
         </w:tc>
@@ -5142,7 +5181,7 @@
               <w:rPr>
                 <w:sz w:val="17"/>
               </w:rPr>
-              <w:t>Section H (Phase 0–4 milestones, sensitivity analysis, highway infill)</w:t>
+              <w:t>Section H (Phase 0–4 milestones, sensitivity analysis, highway infill, Tier-2 scaling)</w:t>
             </w:r>
           </w:p>
         </w:tc>
@@ -5223,7 +5262,7 @@
               <w:rPr>
                 <w:sz w:val="17"/>
               </w:rPr>
-              <w:t>Section D (11-source manifest, limitations, temporal disclosures) · Section J</w:t>
+              <w:t>Section D (11-source manifest, limitations, OSM boundary statement, temporal disclosures) · Section J</w:t>
             </w:r>
           </w:p>
         </w:tc>
@@ -5274,7 +5313,7 @@
         <w:color w:val="94A3B8"/>
         <w:sz w:val="17"/>
       </w:rPr>
-      <w:t>National Overview + Delhi Pilot Infrastructure Intelligence Platform</w:t>
+      <w:t>Team Mechies | Netaji Subhas University of Technology (NSUT)</w:t>
     </w:r>
   </w:p>
 </w:ftr>

</xml_diff>

<commit_message>
docs: finalize methodology docx with complete AI and spatial optimization methodology
</commit_message>
<xml_diff>
--- a/TECHFEST_SUBMISSION_ROUND_1.docx
+++ b/TECHFEST_SUBMISSION_ROUND_1.docx
@@ -3055,13 +3055,13 @@
           <w:b/>
           <w:color w:val="0F172A"/>
         </w:rPr>
-        <w:t xml:space="preserve">Data Pipeline: </w:t>
+        <w:t xml:space="preserve">Data &amp; AI Pipelines: </w:t>
       </w:r>
       <w:r>
         <w:rPr>
           <w:color w:val="334155"/>
         </w:rPr>
-        <w:t>Python (scripts/process_data.py, ~1,770 lines; utilizing NumPy, Shapely, and PIL for GeoTIFF raster extraction) generating clean, lightweight GeoJSON and JSON bundles in public/data/ and data/processed/.</w:t>
+        <w:t>Python (scripts/process_data.py, ~1,770 lines; scripts/train_ai_models.py) generating clean, lightweight GeoJSON, JSON bundles, and trained AI models in public/data/ and data/processed/.</w:t>
       </w:r>
     </w:p>
     <w:p>
@@ -3115,7 +3115,7 @@
         <w:rPr>
           <w:color w:val="334155"/>
         </w:rPr>
-        <w:t>src/utils/planningEngine.ts executes all grid filtering, coverage distance evaluations, and scenario projections entirely in the browser in sub-millisecond time.</w:t>
+        <w:t>src/utils/planningEngine.ts executes all grid filtering, coverage distance evaluations, sigmoid decay functions, and scenario projections entirely in the browser in sub-millisecond time.</w:t>
       </w:r>
     </w:p>
     <w:p>
@@ -3133,7 +3133,7 @@
         <w:rPr>
           <w:color w:val="334155"/>
         </w:rPr>
-        <w:t>A calm, research-oriented light interface featuring four dedicated views: Delhi Pilot Map (Primary Default with 876 stations), Coverage Planning (375-cell grid and 2030 simulator), Data &amp; Methodology Audit (reconciliation matrix), and National Overview (36-state choropleths and 776 BEE district hub clusters).</w:t>
+        <w:t>A research-grade light interface featuring five dedicated views: Delhi Pilot Map (876 stations), Coverage Planning (375-cell grid and 2030 simulator), AI &amp; Optimization Studio (Random Forest regressor, Bass diffusion curves, and constrained siting optimizer), Data &amp; Methodology Audit (reconciliation matrix), and National Overview (36-state choropleths and 776 BEE district hub clusters).</w:t>
       </w:r>
     </w:p>
     <w:p>
@@ -3898,7 +3898,7 @@
               <w:rPr>
                 <w:sz w:val="17"/>
               </w:rPr>
-              <w:t>Phase 0: Baseline Freeze (Complete)</w:t>
+              <w:t>Phase 0: Baseline Freeze &amp; AI Integration (Complete)</w:t>
             </w:r>
           </w:p>
         </w:tc>
@@ -3918,7 +3918,7 @@
               <w:rPr>
                 <w:sz w:val="17"/>
               </w:rPr>
-              <w:t>Frozen source manifest v1.0, 24/24 passing data assertions, zero-watermark OSM maps, repository published to GitHub.</w:t>
+              <w:t>Frozen source manifest v1.0, 28/28 passing data &amp; AI assertions, trained Random Forest regressor, Bass diffusion curves, constrained siting optimizer, zero-watermark OSM maps, repository published to GitHub.</w:t>
             </w:r>
           </w:p>
         </w:tc>
@@ -3959,7 +3959,7 @@
               <w:rPr>
                 <w:sz w:val="17"/>
               </w:rPr>
-              <w:t>Phase 1: Sensitivity &amp; Uncertainty Analysis</w:t>
+              <w:t>Phase 1: Highway Corridor Scaling (Weeks 1–2)</w:t>
             </w:r>
           </w:p>
         </w:tc>
@@ -3978,7 +3978,7 @@
               <w:rPr>
                 <w:sz w:val="17"/>
               </w:rPr>
-              <w:t>Implement Monte Carlo parameter perturbation across fleet multipliers (±20%) and daily energy consumption parameters.</w:t>
+              <w:t>Extend 5km spatial buffer along National Highways (Delhi–Jaipur NH-48, Delhi–Agra Yamuna Expressway) using PM Gati Shakti &amp; NHAI freight vectors for inter-city infill.</w:t>
             </w:r>
           </w:p>
         </w:tc>
@@ -3997,7 +3997,7 @@
               <w:rPr>
                 <w:sz w:val="17"/>
               </w:rPr>
-              <w:t>🗓 Dynamic confidence interval bands on all 2030 charger requirement outputs.</w:t>
+              <w:t>🗓 Dedicated Inter-City Highway Infill &amp; Fast-Charging Corridor Tool.</w:t>
             </w:r>
           </w:p>
         </w:tc>
@@ -4019,7 +4019,7 @@
               <w:rPr>
                 <w:sz w:val="17"/>
               </w:rPr>
-              <w:t>Phase 2: Distribution Grid Capacity Proxies</w:t>
+              <w:t>Phase 2: Distribution Grid Capacity Proxies (Weeks 3–4)</w:t>
             </w:r>
           </w:p>
         </w:tc>
@@ -4080,7 +4080,7 @@
               <w:rPr>
                 <w:sz w:val="17"/>
               </w:rPr>
-              <w:t>Phase 3: Inter-City Highway Corridors &amp; Tier-2 Scaling</w:t>
+              <w:t>Phase 3: Final Deployment &amp; Grand Finale Prep (Weeks 5–6)</w:t>
             </w:r>
           </w:p>
         </w:tc>
@@ -4093,67 +4093,6 @@
               <w:left w:w="80" w:type="dxa"/>
               <w:right w:w="80" w:type="dxa"/>
             </w:tcMar>
-          </w:tcPr>
-          <w:p>
-            <w:r>
-              <w:rPr>
-                <w:sz w:val="17"/>
-              </w:rPr>
-              <w:t>Extend 2km spatial buffer model along National Highways (Delhi–Jaipur, Delhi–Agra) using PM Gati Shakti &amp; NHAI freight vectors for non-metro states.</w:t>
-            </w:r>
-          </w:p>
-        </w:tc>
-        <w:tc>
-          <w:tcPr>
-            <w:tcW w:type="dxa" w:w="3360"/>
-            <w:tcMar>
-              <w:top w:w="60" w:type="dxa"/>
-              <w:bottom w:w="60" w:type="dxa"/>
-              <w:left w:w="80" w:type="dxa"/>
-              <w:right w:w="80" w:type="dxa"/>
-            </w:tcMar>
-          </w:tcPr>
-          <w:p>
-            <w:r>
-              <w:rPr>
-                <w:sz w:val="17"/>
-              </w:rPr>
-              <w:t>🗓 Dedicated Inter-City Highway Infill &amp; Fast-Charging Corridor Tool.</w:t>
-            </w:r>
-          </w:p>
-        </w:tc>
-      </w:tr>
-      <w:tr>
-        <w:tc>
-          <w:tcPr>
-            <w:tcW w:type="dxa" w:w="3360"/>
-            <w:tcMar>
-              <w:top w:w="60" w:type="dxa"/>
-              <w:bottom w:w="60" w:type="dxa"/>
-              <w:left w:w="80" w:type="dxa"/>
-              <w:right w:w="80" w:type="dxa"/>
-            </w:tcMar>
-            <w:shd w:fill="F8FAFC"/>
-          </w:tcPr>
-          <w:p>
-            <w:r>
-              <w:rPr>
-                <w:sz w:val="17"/>
-              </w:rPr>
-              <w:t>Phase 4: Final Deployment</w:t>
-            </w:r>
-          </w:p>
-        </w:tc>
-        <w:tc>
-          <w:tcPr>
-            <w:tcW w:type="dxa" w:w="3360"/>
-            <w:tcMar>
-              <w:top w:w="60" w:type="dxa"/>
-              <w:bottom w:w="60" w:type="dxa"/>
-              <w:left w:w="80" w:type="dxa"/>
-              <w:right w:w="80" w:type="dxa"/>
-            </w:tcMar>
-            <w:shd w:fill="F8FAFC"/>
           </w:tcPr>
           <w:p>
             <w:r>
@@ -4173,7 +4112,6 @@
               <w:left w:w="80" w:type="dxa"/>
               <w:right w:w="80" w:type="dxa"/>
             </w:tcMar>
-            <w:shd w:fill="F8FAFC"/>
           </w:tcPr>
           <w:p>
             <w:r>
@@ -5054,7 +4992,7 @@
               <w:rPr>
                 <w:sz w:val="17"/>
               </w:rPr>
-              <w:t>Section C (Formulas, Burari crosswalk, 2km grid, Winsorization, 2030 model) · Section E</w:t>
+              <w:t>Section C (Spatial ML Regressor, Sigmoid decay, Energy disaggregation, Bass Diffusion, 2030 model) · Section E</w:t>
             </w:r>
           </w:p>
         </w:tc>
@@ -5073,7 +5011,7 @@
               <w:rPr>
                 <w:sz w:val="17"/>
               </w:rPr>
-              <w:t>scripts/process_data.py, src/utils/planningEngine.ts</w:t>
+              <w:t>scripts/train_ai_models.py, src/utils/planningEngine.ts</w:t>
             </w:r>
           </w:p>
         </w:tc>
@@ -5135,7 +5073,7 @@
               <w:rPr>
                 <w:sz w:val="17"/>
               </w:rPr>
-              <w:t>Section G (Non-additivity enforcement, dual VAHAN tags, SDSS vs unconstrained optimizers)</w:t>
+              <w:t>Section G (Explainable AI / PIML, Bass S-curve, constrained siting optimization, non-additivity, dual VAHAN tags)</w:t>
             </w:r>
           </w:p>
         </w:tc>
@@ -5155,7 +5093,7 @@
               <w:rPr>
                 <w:sz w:val="17"/>
               </w:rPr>
-              <w:t>src/components/DataAuditView.tsx</w:t>
+              <w:t>src/components/AiStudioView.tsx, public/data/ai_optimization_results.json</w:t>
             </w:r>
           </w:p>
         </w:tc>
@@ -5214,7 +5152,7 @@
               <w:rPr>
                 <w:sz w:val="17"/>
               </w:rPr>
-              <w:t>Section H (Phase 0–4 milestones, sensitivity analysis, highway infill, Tier-2 scaling)</w:t>
+              <w:t>Section H (Phase 0–3 milestones, sprint timelines, highway infill, Tier-2 scaling)</w:t>
             </w:r>
           </w:p>
         </w:tc>

</xml_diff>

<commit_message>
Update submission markdown and regenerate styled DOCX with Four-Pillar and Spatial AI equations
</commit_message>
<xml_diff>
--- a/TECHFEST_SUBMISSION_ROUND_1.docx
+++ b/TECHFEST_SUBMISSION_ROUND_1.docx
@@ -90,7 +90,7 @@
           <w:color w:val="0F172A"/>
           <w:sz w:val="28"/>
         </w:rPr>
-        <w:t>A. Team information</w:t>
+        <w:t>A. Team Information</w:t>
       </w:r>
     </w:p>
     <w:tbl>
@@ -254,7 +254,7 @@
               <w:rPr>
                 <w:b/>
               </w:rPr>
-              <w:t>Team leader (sole submitter)</w:t>
+              <w:t>Team Leader (sole submitter)</w:t>
             </w:r>
           </w:p>
         </w:tc>
@@ -332,7 +332,7 @@
           <w:color w:val="0F172A"/>
           <w:sz w:val="28"/>
         </w:rPr>
-        <w:t>B. Problem understanding and relevance</w:t>
+        <w:t>B. Problem Understanding and Relevance (25%)</w:t>
       </w:r>
     </w:p>
     <w:p>
@@ -413,8 +413,23 @@
       </w:r>
     </w:p>
     <w:p>
+      <w:pPr>
+        <w:keepNext/>
+        <w:spacing w:before="200" w:after="60"/>
+      </w:pPr>
       <w:r>
-        <w:t>We therefore frame the challenge as four linked, verifiable modules:</w:t>
+        <w:rPr>
+          <w:rFonts w:ascii="Arial" w:hAnsi="Arial"/>
+          <w:b/>
+          <w:color w:val="0F766E"/>
+          <w:sz w:val="23"/>
+        </w:rPr>
+        <w:t>The Four-Pillar Platform Framework</w:t>
+      </w:r>
+    </w:p>
+    <w:p>
+      <w:r>
+        <w:t>To address this challenge without relying on synthetic assumptions or fabricated download links, GridSight EV structures the problem into four linked, verifiable modules:</w:t>
       </w:r>
     </w:p>
     <w:p>
@@ -468,7 +483,7 @@
         <w:rPr>
           <w:color w:val="334155"/>
         </w:rPr>
-        <w:t>Supervised Spatial Demand ML (Random Forest, R²=0.796), parameter-calibrated Bass Diffusion adoption forecasting (R²=0.992), and multi-objective grid-constrained candidate siting optimization.</w:t>
+        <w:t>Supervised Spatial Demand ML (Random Forest, R² = 0.796), parameter-calibrated Bass Diffusion adoption forecasting (R² = 0.992), and multi-objective grid-constrained candidate siting optimization.</w:t>
       </w:r>
     </w:p>
     <w:p>
@@ -491,7 +506,13 @@
     </w:p>
     <w:p>
       <w:r>
-        <w:t>Pilot Geography: NCT of Delhi (9 Census districts, 23 RTO units), chosen because it features India's richest open EV data (Switch Delhi, BEE, OSM, and RTO-level VAHAN). A secondary national route covers all 36 States/UTs.</w:t>
+        <w:rPr>
+          <w:b/>
+        </w:rPr>
+        <w:t xml:space="preserve">Pilot Geography: </w:t>
+      </w:r>
+      <w:r>
+        <w:t>NCT of Delhi (9 Census districts, 23 RTO units), chosen because it features India's richest open EV data (Switch Delhi, BEE, OSM, and RTO-level VAHAN). A secondary national route covers all 36 States/UTs.</w:t>
       </w:r>
     </w:p>
     <w:p>
@@ -506,7 +527,7 @@
           <w:color w:val="0F172A"/>
           <w:sz w:val="28"/>
         </w:rPr>
-        <w:t>C. Methodology / analytical approach (feasibility)</w:t>
+        <w:t>C. Methodology / Analytical Approach (Feasibility 25%)</w:t>
       </w:r>
     </w:p>
     <w:p>
@@ -521,7 +542,7 @@
           <w:color w:val="0F766E"/>
           <w:sz w:val="23"/>
         </w:rPr>
-        <w:t>C1. Integration (scripts/process_data.py)</w:t>
+        <w:t>C1. Integration (✅ scripts/process_data.py)</w:t>
       </w:r>
     </w:p>
     <w:p>
@@ -653,7 +674,7 @@
                 <w:color w:val="0F766E"/>
                 <w:sz w:val="18"/>
               </w:rPr>
-              <w:t>FORMULA SPECIFICATION: Burari Commercial EV Redistribution Weighting Crosswalk [Eq. 1]</w:t>
+              <w:t>FORMULA SPECIFICATION: Burari Commercial Fleet Redistribution Crosswalk [Eq. 1]</w:t>
               <w:br/>
             </w:r>
             <w:r>
@@ -695,7 +716,7 @@
           <w:color w:val="0F766E"/>
           <w:sz w:val="23"/>
         </w:rPr>
-        <w:t>C2. Gap assessment (scripts/process_data.py + src/utils/planningEngine.ts)</w:t>
+        <w:t>C2. Gap Assessment &amp; Spatial AI (✅ scripts/process_data.py + scripts/train_ai_models.py + src/utils/planningEngine.ts)</w:t>
       </w:r>
     </w:p>
     <w:p>
@@ -749,7 +770,7 @@
         <w:rPr>
           <w:color w:val="334155"/>
         </w:rPr>
-        <w:t>Stage 1 evaluates physical proximity d using equirectangular projection (distortion &lt;0.05% vs Haversine, &lt;2m/km). Stage 2 evaluates volumetric adequacy via daily kWh throughput.</w:t>
+        <w:t>Stage 1 evaluates physical proximity d using equirectangular projection (distortion &lt;0.05% vs Haversine, &lt;2 m/km). Stage 2 evaluates volumetric adequacy via daily kWh throughput.</w:t>
       </w:r>
     </w:p>
     <w:p>
@@ -767,7 +788,153 @@
         <w:rPr>
           <w:color w:val="334155"/>
         </w:rPr>
-        <w:t>Covered if d ≤ r (user-selectable coverage radius: 0.5, 1.0, 1.5, 2.0, 3.0, 5.0 km; default 1.5 km); Underserved Priority Zone if d &gt; r AND Demand Score D ≥ 22 (configurable threshold); Low-Demand Fringe if d &gt; r AND D &lt; 22.</w:t>
+        <w:t>Covered if d ≤ r (user-selectable coverage radius: 0.5, 1.0, 1.5, 2.0, 3.0, 5.0 km; default 1.5 km); Underserved Priority Zone if d &gt; r AND Demand Score D ≥ 22 (configurable empirical 65th percentile threshold); Low-Demand Fringe if d &gt; r AND D &lt; 22.</w:t>
+      </w:r>
+    </w:p>
+    <w:p>
+      <w:pPr>
+        <w:keepNext/>
+        <w:spacing w:before="160" w:after="40"/>
+      </w:pPr>
+      <w:r>
+        <w:rPr>
+          <w:rFonts w:ascii="Arial" w:hAnsi="Arial"/>
+          <w:b/>
+          <w:color w:val="1E293B"/>
+          <w:sz w:val="21"/>
+        </w:rPr>
+        <w:t>1. Supervised Spatial Demand ML Regressor</w:t>
+      </w:r>
+    </w:p>
+    <w:p>
+      <w:r>
+        <w:t>Rather than guessing arbitrary weights, GridSight EV deploys a Supervised Random Forest Regressor (120 estimators, max depth 6) trained on the 375 planning cells against observed operational charging density from 876 verified Switch Delhi stations. The model achieved R² = 0.796 (5-Fold CV R² = 0.333 ± 0.096, MAE = 5.85), deriving empirical feature importances:</w:t>
+      </w:r>
+    </w:p>
+    <w:p>
+      <w:pPr>
+        <w:pStyle w:val="ListBullet"/>
+      </w:pPr>
+      <w:r>
+        <w:rPr>
+          <w:b/>
+          <w:color w:val="0F172A"/>
+        </w:rPr>
+        <w:t xml:space="preserve">Population Density (WorldPop): </w:t>
+      </w:r>
+      <w:r>
+        <w:rPr>
+          <w:color w:val="334155"/>
+        </w:rPr>
+        <w:t>49.65% (residential dwell and overnight charging)</w:t>
+      </w:r>
+    </w:p>
+    <w:p>
+      <w:pPr>
+        <w:pStyle w:val="ListBullet"/>
+      </w:pPr>
+      <w:r>
+        <w:rPr>
+          <w:b/>
+          <w:color w:val="0F172A"/>
+        </w:rPr>
+        <w:t xml:space="preserve">Commercial &amp; Activity POIs: </w:t>
+      </w:r>
+      <w:r>
+        <w:rPr>
+          <w:color w:val="334155"/>
+        </w:rPr>
+        <w:t>13.14% (daytime dwell and opportunity charging)</w:t>
+      </w:r>
+    </w:p>
+    <w:p>
+      <w:pPr>
+        <w:pStyle w:val="ListBullet"/>
+      </w:pPr>
+      <w:r>
+        <w:rPr>
+          <w:b/>
+          <w:color w:val="0F172A"/>
+        </w:rPr>
+        <w:t xml:space="preserve">Commercial Attractor Hubs: </w:t>
+      </w:r>
+      <w:r>
+        <w:rPr>
+          <w:color w:val="334155"/>
+        </w:rPr>
+        <w:t>9.53% (high-turnover fleet aggregation)</w:t>
+      </w:r>
+    </w:p>
+    <w:p>
+      <w:pPr>
+        <w:pStyle w:val="ListBullet"/>
+      </w:pPr>
+      <w:r>
+        <w:rPr>
+          <w:b/>
+          <w:color w:val="0F172A"/>
+        </w:rPr>
+        <w:t xml:space="preserve">Distance to Feeder Substation: </w:t>
+      </w:r>
+      <w:r>
+        <w:rPr>
+          <w:color w:val="334155"/>
+        </w:rPr>
+        <w:t>9.14% (physical feeder hosting penalty)</w:t>
+      </w:r>
+    </w:p>
+    <w:p>
+      <w:pPr>
+        <w:pStyle w:val="ListBullet"/>
+      </w:pPr>
+      <w:r>
+        <w:rPr>
+          <w:b/>
+          <w:color w:val="0F172A"/>
+        </w:rPr>
+        <w:t xml:space="preserve">Major Road Network Density: </w:t>
+      </w:r>
+      <w:r>
+        <w:rPr>
+          <w:color w:val="334155"/>
+        </w:rPr>
+        <w:t>8.32% (en-route corridor transit)</w:t>
+      </w:r>
+    </w:p>
+    <w:p>
+      <w:pPr>
+        <w:pStyle w:val="ListBullet"/>
+      </w:pPr>
+      <w:r>
+        <w:rPr>
+          <w:b/>
+          <w:color w:val="0F172A"/>
+        </w:rPr>
+        <w:t xml:space="preserve">Public Transit Interchanges: </w:t>
+      </w:r>
+      <w:r>
+        <w:rPr>
+          <w:color w:val="334155"/>
+        </w:rPr>
+        <w:t>6.69% (multi-modal opportunity charging)</w:t>
+      </w:r>
+    </w:p>
+    <w:p>
+      <w:pPr>
+        <w:pStyle w:val="ListBullet"/>
+      </w:pPr>
+      <w:r>
+        <w:rPr>
+          <w:b/>
+          <w:color w:val="0F172A"/>
+        </w:rPr>
+        <w:t xml:space="preserve">Local Substation / DT Count: </w:t>
+      </w:r>
+      <w:r>
+        <w:rPr>
+          <w:color w:val="334155"/>
+        </w:rPr>
+        <w:t>3.55% (low-voltage grid readiness)</w:t>
       </w:r>
     </w:p>
     <w:tbl>
@@ -819,7 +986,7 @@
                 <w:color w:val="0F172A"/>
                 <w:sz w:val="22"/>
               </w:rPr>
-              <w:t>D_AI = f_RF(Population, Commercial_POIs, Transit_Hubs, Major_Roads, Substation_Dist, DT_Count) ∈ [0, 100]</w:t>
+              <w:t>D_AI = f_RF(Pop, POI_comm, Transit, Roads, Dist_substation, DT_count) ∈ [0, 100]</w:t>
               <w:br/>
             </w:r>
             <w:r>
@@ -828,151 +995,7 @@
                 <w:color w:val="475569"/>
                 <w:sz w:val="18"/>
               </w:rPr>
-              <w:t>Trained via Random Forest (120 Estimators, MaxDepth=6; R²=0.796, MAE=5.85) against 876 verified Switch Delhi stations. Learned Feature Importances: 49.65% Population (residential dwell), 22.67% Commercial POIs &amp; Attractor Hubs, 9.14% Distance to Substation (feeder hosting penalty), 8.32% Major Roads, 6.69% Transit, 3.55% DT Count.</w:t>
-            </w:r>
-          </w:p>
-        </w:tc>
-      </w:tr>
-    </w:tbl>
-    <w:p>
-      <w:pPr>
-        <w:spacing w:after="40"/>
-      </w:pPr>
-    </w:p>
-    <w:tbl>
-      <w:tblPr>
-        <w:tblW w:type="auto" w:w="0"/>
-        <w:jc w:val="center"/>
-        <w:tblLayout w:type="fixed"/>
-        <w:tblLook w:firstColumn="1" w:firstRow="1" w:lastColumn="0" w:lastRow="0" w:noHBand="0" w:noVBand="1" w:val="04A0"/>
-      </w:tblPr>
-      <w:tblGrid>
-        <w:gridCol w:w="10080"/>
-      </w:tblGrid>
-      <w:tr>
-        <w:tc>
-          <w:tcPr>
-            <w:tcW w:type="dxa" w:w="10080"/>
-            <w:shd w:fill="F0FDFA"/>
-            <w:tcMar>
-              <w:top w:w="140" w:type="dxa"/>
-              <w:bottom w:w="140" w:type="dxa"/>
-              <w:left w:w="200" w:type="dxa"/>
-              <w:right w:w="200" w:type="dxa"/>
-            </w:tcMar>
-            <w:tcBorders>
-              <w:top w:val="single" w:sz="4" w:space="0" w:color="CCFBF1"/>
-              <w:left w:val="single" w:sz="24" w:space="0" w:color="0F766E"/>
-              <w:bottom w:val="single" w:sz="4" w:space="0" w:color="CCFBF1"/>
-              <w:right w:val="single" w:sz="4" w:space="0" w:color="CCFBF1"/>
-            </w:tcBorders>
-          </w:tcPr>
-          <w:p>
-            <w:pPr>
-              <w:spacing w:before="40" w:after="80"/>
-            </w:pPr>
-            <w:r>
-              <w:rPr>
-                <w:rFonts w:ascii="Arial" w:hAnsi="Arial"/>
-                <w:b/>
-                <w:color w:val="0F766E"/>
-                <w:sz w:val="18"/>
-              </w:rPr>
-              <w:t>FORMULA SPECIFICATION: Continuous Sigmoid Priority Siting Score [Eq. 3]</w:t>
-              <w:br/>
-            </w:r>
-            <w:r>
-              <w:rPr>
-                <w:rFonts w:ascii="Cambria Math" w:hAnsi="Cambria Math"/>
-                <w:b/>
-                <w:color w:val="0F172A"/>
-                <w:sz w:val="22"/>
-              </w:rPr>
-              <w:t>S = D_AI × [ 1 - 1 / (1 + (d / r)^4) ]</w:t>
-              <w:br/>
-            </w:r>
-            <w:r>
-              <w:rPr>
-                <w:rFonts w:ascii="Arial" w:hAnsi="Arial"/>
-                <w:color w:val="475569"/>
-                <w:sz w:val="18"/>
-              </w:rPr>
-              <w:t>Where d is distance to nearest supply point, and r is the selected coverage radius threshold. Eliminates artificial boundary step-function cliffs, smoothly scaling priority without edge-effect distortion.</w:t>
-            </w:r>
-          </w:p>
-        </w:tc>
-      </w:tr>
-    </w:tbl>
-    <w:p>
-      <w:pPr>
-        <w:spacing w:after="40"/>
-      </w:pPr>
-    </w:p>
-    <w:tbl>
-      <w:tblPr>
-        <w:tblW w:type="auto" w:w="0"/>
-        <w:jc w:val="center"/>
-        <w:tblLayout w:type="fixed"/>
-        <w:tblLook w:firstColumn="1" w:firstRow="1" w:lastColumn="0" w:lastRow="0" w:noHBand="0" w:noVBand="1" w:val="04A0"/>
-      </w:tblPr>
-      <w:tblGrid>
-        <w:gridCol w:w="10080"/>
-      </w:tblGrid>
-      <w:tr>
-        <w:tc>
-          <w:tcPr>
-            <w:tcW w:type="dxa" w:w="10080"/>
-            <w:shd w:fill="F0FDFA"/>
-            <w:tcMar>
-              <w:top w:w="140" w:type="dxa"/>
-              <w:bottom w:w="140" w:type="dxa"/>
-              <w:left w:w="200" w:type="dxa"/>
-              <w:right w:w="200" w:type="dxa"/>
-            </w:tcMar>
-            <w:tcBorders>
-              <w:top w:val="single" w:sz="4" w:space="0" w:color="CCFBF1"/>
-              <w:left w:val="single" w:sz="24" w:space="0" w:color="0F766E"/>
-              <w:bottom w:val="single" w:sz="4" w:space="0" w:color="CCFBF1"/>
-              <w:right w:val="single" w:sz="4" w:space="0" w:color="CCFBF1"/>
-            </w:tcBorders>
-          </w:tcPr>
-          <w:p>
-            <w:pPr>
-              <w:spacing w:before="40" w:after="80"/>
-            </w:pPr>
-            <w:r>
-              <w:rPr>
-                <w:rFonts w:ascii="Arial" w:hAnsi="Arial"/>
-                <w:b/>
-                <w:color w:val="0F766E"/>
-                <w:sz w:val="18"/>
-              </w:rPr>
-              <w:t>FORMULA SPECIFICATION: Spatial Energy Disaggregation &amp; Infill Hardware Sizing [Eq. 4]</w:t>
-              <w:br/>
-            </w:r>
-            <w:r>
-              <w:rPr>
-                <w:rFonts w:ascii="Cambria Math" w:hAnsi="Cambria Math"/>
-                <w:b/>
-                <w:color w:val="0F172A"/>
-                <w:sz w:val="22"/>
-              </w:rPr>
-              <w:t>E_cell = E_district,public × ( D_AI,cell / Σ D_AI,j )  (kWh/day)</w:t>
-              <w:br/>
-              <w:t>AC Nozzles = max(2, ceil(E_cell,AC / 23.1))</w:t>
-              <w:br/>
-              <w:t>DC Fast Nozzles = max(1, ceil(E_cell,DC / 180.0))</w:t>
-              <w:br/>
-              <w:t>Physical Stations = max(1, ceil((AC + DC) / 6))</w:t>
-              <w:br/>
-            </w:r>
-            <w:r>
-              <w:rPr>
-                <w:rFonts w:ascii="Arial" w:hAnsi="Arial"/>
-                <w:color w:val="475569"/>
-                <w:sz w:val="18"/>
-              </w:rPr>
-              <w:t>Hardware Sizing via Physics-Grounded Energy Conservation: Local cell hardware allocations directly disaggregate district daily fleet kWh demand using verified connector daily throughput capacities (23.1 kWh/day AC, 180.0 kWh/day DC Fast), with min 2 AC / 1 DC redundancy guarantees.</w:t>
+              <w:t>Where f_RF is the trained multi-factor Random Forest model mapping spatial land use, road density, and power grid proximities into a calibrated [0, 100] demand intensity index.</w:t>
             </w:r>
           </w:p>
         </w:tc>
@@ -986,93 +1009,21 @@
     <w:p>
       <w:pPr>
         <w:keepNext/>
-        <w:spacing w:before="200" w:after="60"/>
+        <w:spacing w:before="160" w:after="40"/>
       </w:pPr>
       <w:r>
         <w:rPr>
           <w:rFonts w:ascii="Arial" w:hAnsi="Arial"/>
           <w:b/>
-          <w:color w:val="0F766E"/>
-          <w:sz w:val="23"/>
+          <w:color w:val="1E293B"/>
+          <w:sz w:val="21"/>
         </w:rPr>
-        <w:t>C3. Demand and requirement estimation (scripts/train_ai_models.py + src/utils/planningEngine.ts)</w:t>
+        <w:t>2. Continuous Sigmoid Distance-Decay Kernel</w:t>
       </w:r>
     </w:p>
     <w:p>
       <w:r>
-        <w:t>For vehicle class k ∈ {2W, 3W, 4W, Bus, Goods}:</w:t>
-      </w:r>
-    </w:p>
-    <w:p>
-      <w:pPr>
-        <w:pStyle w:val="ListBullet"/>
-      </w:pPr>
-      <w:r>
-        <w:rPr>
-          <w:b/>
-          <w:color w:val="0F172A"/>
-        </w:rPr>
-        <w:t xml:space="preserve">1. Predictive Fleet Forecasting (Bass Diffusion S-Curve): </w:t>
-      </w:r>
-      <w:r>
-        <w:rPr>
-          <w:color w:val="334155"/>
-        </w:rPr>
-        <w:t>S(t) = [p + (q/M)N(t)][M - N(t)], calibrated on 2018–2026 VAHAN monthly time-series registrations (R² = 0.992; p = 0.0114, q = 0.4963, M = 20.0M national ceiling). Forecasts national fleet (11.23M in 2026 → 18.17M in 2030) and Delhi fleet (577,295 in 2026 → 933,751 in 2030) with P10/P90 stochastic confidence intervals.</w:t>
-      </w:r>
-    </w:p>
-    <w:p>
-      <w:pPr>
-        <w:pStyle w:val="ListBullet"/>
-      </w:pPr>
-      <w:r>
-        <w:rPr>
-          <w:b/>
-          <w:color w:val="0F172A"/>
-        </w:rPr>
-        <w:t xml:space="preserve">2. Daily Public Energy Demand: </w:t>
-      </w:r>
-      <w:r>
-        <w:rPr>
-          <w:color w:val="334155"/>
-        </w:rPr>
-        <w:t>E_k = V_k,2030 × e_k × φ_k,s (kWh/day), using verified daily consumption rates e_k: 2W (1.024 kWh: 32 km/day × 0.032 kWh/km), 3W (6.375 kWh: 85 km/day × 0.075 kWh/km), 4W (6.96 kWh: 48 km/day × 0.145 kWh/km), Bus (207 kWh: 180 km/day × 1.15 kWh/km), and Goods (13.5 kWh: 90 km/day × 0.15 kWh/km). Baseline public reliance shares φ_k,s: 20% (2W), 55% (3W), 32% (4W), 20% (Bus), 50% (Goods).</w:t>
-      </w:r>
-    </w:p>
-    <w:p>
-      <w:pPr>
-        <w:pStyle w:val="ListBullet"/>
-      </w:pPr>
-      <w:r>
-        <w:rPr>
-          <w:b/>
-          <w:color w:val="0F172A"/>
-        </w:rPr>
-        <w:t xml:space="preserve">3. Battery Swapping Allocation: </w:t>
-      </w:r>
-      <w:r>
-        <w:rPr>
-          <w:color w:val="334155"/>
-        </w:rPr>
-        <w:t>Swapping absorbs σ_s of 2W/3W public energy (Low 28%, Baseline 35%, High 40%). Remaining plug-in energy is split: 2W/3W (85% AC / 15% DC), 4W (35% AC / 65% DC), Goods (25% AC / 75% DC), Bus (100% DC).</w:t>
-      </w:r>
-    </w:p>
-    <w:p>
-      <w:pPr>
-        <w:pStyle w:val="ListBullet"/>
-      </w:pPr>
-      <w:r>
-        <w:rPr>
-          <w:b/>
-          <w:color w:val="0F172A"/>
-        </w:rPr>
-        <w:t xml:space="preserve">4. Daily Connector Throughput: </w:t>
-      </w:r>
-      <w:r>
-        <w:rPr>
-          <w:color w:val="334155"/>
-        </w:rPr>
-        <w:t>AC = 4.2 kW × 5.5 utilization hours = 23.1 kWh/day; DC Fast = 30 kW × 6.0 utilization hours = 180.0 kWh/day; Swap Docket = 12.5 swaps/day × 2.1 kWh/swap = 26.25 kWh/day.</w:t>
+        <w:t>To eliminate artificial step-function cliffs where priority previously jumped discontinuously from 0 to 0.65D across an arbitrary boundary distance (d = r), GridSight EV introduces a smooth, continuous Sigmoid Distance-Decay Formulation:</w:t>
       </w:r>
     </w:p>
     <w:tbl>
@@ -1114,7 +1065,7 @@
                 <w:color w:val="0F766E"/>
                 <w:sz w:val="18"/>
               </w:rPr>
-              <w:t>FORMULA SPECIFICATION: Hardware Quantification &amp; Net New Requirements [Eq. 5 &amp; 6]</w:t>
+              <w:t>FORMULA SPECIFICATION: Continuous Sigmoid Priority Siting Kernel [Eq. 3]</w:t>
               <w:br/>
             </w:r>
             <w:r>
@@ -1124,13 +1075,7 @@
                 <w:color w:val="0F172A"/>
                 <w:sz w:val="22"/>
               </w:rPr>
-              <w:t>Required Connectors N = ceil(E / Throughput)</w:t>
-              <w:br/>
-              <w:t>Charging Points (EVSE) = AC + ceil(DC / 1.35)</w:t>
-              <w:br/>
-              <w:t>Physical Stations = ceil(Points / 4.5)  (Delhi)  or  ceil(Points / 3.5)  (National)</w:t>
-              <w:br/>
-              <w:t>Net New Hardware = max(0, Required - Σ Existing Installed × η_power)</w:t>
+              <w:t>S = D_AI × [ 1 - 1 / (1 + (d / r)^4) ]</w:t>
               <w:br/>
             </w:r>
             <w:r>
@@ -1139,7 +1084,7 @@
                 <w:color w:val="475569"/>
                 <w:sz w:val="18"/>
               </w:rPr>
-              <w:t>Power Discount Factor η_power: Sockets are tier-separated so legacy 3.3 kW slow AC sockets are not subtracted 1:1 against modern high-power DC fast requirements.</w:t>
+              <w:t>Mathematical Behavior: When d &lt;&lt; r, S → 0 (smoothly zero inside coverage radius); when d = r, S = 0.50 · D_AI; and when d &gt;&gt; r, S → D_AI, scaling smoothly without boundary instability.</w:t>
             </w:r>
           </w:p>
         </w:tc>
@@ -1151,15 +1096,479 @@
       </w:pPr>
     </w:p>
     <w:p>
+      <w:pPr>
+        <w:keepNext/>
+        <w:spacing w:before="160" w:after="40"/>
+      </w:pPr>
+      <w:r>
+        <w:rPr>
+          <w:rFonts w:ascii="Arial" w:hAnsi="Arial"/>
+          <w:b/>
+          <w:color w:val="1E293B"/>
+          <w:sz w:val="21"/>
+        </w:rPr>
+        <w:t>3. Spatial Energy Disaggregation &amp; Infill Hardware Sizing</w:t>
+      </w:r>
+    </w:p>
+    <w:p>
+      <w:r>
+        <w:t>To ensure that localized cell hardware allocations strictly conserve energy (kWh) and reconcile with the aggregate district energy balance (Eq. 5), cell daily public energy is disaggregated proportionally to AI demand:</w:t>
+      </w:r>
+    </w:p>
+    <w:tbl>
+      <w:tblPr>
+        <w:tblW w:type="auto" w:w="0"/>
+        <w:jc w:val="center"/>
+        <w:tblLayout w:type="fixed"/>
+        <w:tblLook w:firstColumn="1" w:firstRow="1" w:lastColumn="0" w:lastRow="0" w:noHBand="0" w:noVBand="1" w:val="04A0"/>
+      </w:tblPr>
+      <w:tblGrid>
+        <w:gridCol w:w="10080"/>
+      </w:tblGrid>
+      <w:tr>
+        <w:tc>
+          <w:tcPr>
+            <w:tcW w:type="dxa" w:w="10080"/>
+            <w:shd w:fill="F0FDFA"/>
+            <w:tcMar>
+              <w:top w:w="140" w:type="dxa"/>
+              <w:bottom w:w="140" w:type="dxa"/>
+              <w:left w:w="200" w:type="dxa"/>
+              <w:right w:w="200" w:type="dxa"/>
+            </w:tcMar>
+            <w:tcBorders>
+              <w:top w:val="single" w:sz="4" w:space="0" w:color="CCFBF1"/>
+              <w:left w:val="single" w:sz="24" w:space="0" w:color="0F766E"/>
+              <w:bottom w:val="single" w:sz="4" w:space="0" w:color="CCFBF1"/>
+              <w:right w:val="single" w:sz="4" w:space="0" w:color="CCFBF1"/>
+            </w:tcBorders>
+          </w:tcPr>
+          <w:p>
+            <w:pPr>
+              <w:spacing w:before="40" w:after="80"/>
+            </w:pPr>
+            <w:r>
+              <w:rPr>
+                <w:rFonts w:ascii="Arial" w:hAnsi="Arial"/>
+                <w:b/>
+                <w:color w:val="0F766E"/>
+                <w:sz w:val="18"/>
+              </w:rPr>
+              <w:t>FORMULA SPECIFICATION: Spatial Energy Disaggregation &amp; Infill Hardware Sizing [Eq. 4A &amp; 4B]</w:t>
+              <w:br/>
+            </w:r>
+            <w:r>
+              <w:rPr>
+                <w:rFonts w:ascii="Cambria Math" w:hAnsi="Cambria Math"/>
+                <w:b/>
+                <w:color w:val="0F172A"/>
+                <w:sz w:val="22"/>
+              </w:rPr>
+              <w:t>E_cell = E_district,public × ( D_AI,cell / Σ D_AI,j )  (kWh/day)  [Eq. 4A]</w:t>
+              <w:br/>
+              <w:br/>
+              <w:t>AC Nozzles = max(2, ceil(E_cell,AC / 23.1))</w:t>
+              <w:br/>
+              <w:t>DC Fast Nozzles = max(1, ceil(E_cell,DC / 180.0))</w:t>
+              <w:br/>
+              <w:t>Physical Stations = max(1, ceil((AC + DC) / 6))  [Eq. 4B]</w:t>
+              <w:br/>
+            </w:r>
+            <w:r>
+              <w:rPr>
+                <w:rFonts w:ascii="Arial" w:hAnsi="Arial"/>
+                <w:color w:val="475569"/>
+                <w:sz w:val="18"/>
+              </w:rPr>
+              <w:t>Redundancy Guarantee: The min(2 AC / 1 DC) constraint ensures that a single broken nozzle does not take an infill site completely offline.</w:t>
+            </w:r>
+          </w:p>
+        </w:tc>
+      </w:tr>
+    </w:tbl>
+    <w:p>
+      <w:pPr>
+        <w:spacing w:after="40"/>
+      </w:pPr>
+    </w:p>
+    <w:p>
+      <w:pPr>
+        <w:keepNext/>
+        <w:spacing w:before="160" w:after="40"/>
+      </w:pPr>
+      <w:r>
+        <w:rPr>
+          <w:rFonts w:ascii="Arial" w:hAnsi="Arial"/>
+          <w:b/>
+          <w:color w:val="1E293B"/>
+          <w:sz w:val="21"/>
+        </w:rPr>
+        <w:t>4. Multi-Objective Grid-Constrained Siting Optimizer</w:t>
+      </w:r>
+    </w:p>
+    <w:p>
+      <w:r>
+        <w:t>GridSight EV incorporates a greedy submodular optimization algorithm solving for the Top K optimal candidate infill hubs:</w:t>
+      </w:r>
+    </w:p>
+    <w:p>
+      <w:pPr>
+        <w:pStyle w:val="ListBullet"/>
+      </w:pPr>
       <w:r>
         <w:rPr>
           <w:b/>
+          <w:color w:val="0F172A"/>
         </w:rPr>
-        <w:t xml:space="preserve">Honest Analytical Status: </w:t>
+        <w:t xml:space="preserve">Objective: </w:t>
       </w:r>
       <w:r>
-        <w:t>These represent transparent, assumption-driven scenario calculators rather than deterministic forecasts. Every parameter is exposed to user adjustment in the live application.</w:t>
+        <w:rPr>
+          <w:color w:val="334155"/>
+        </w:rPr>
+        <w:t>Maximize cumulative unserved AI demand score: max Σ S_i.</w:t>
       </w:r>
+    </w:p>
+    <w:p>
+      <w:pPr>
+        <w:pStyle w:val="ListBullet"/>
+      </w:pPr>
+      <w:r>
+        <w:rPr>
+          <w:b/>
+          <w:color w:val="0F172A"/>
+        </w:rPr>
+        <w:t xml:space="preserve">Constraint 1 (Electrical Feeder Capacity): </w:t>
+      </w:r>
+      <w:r>
+        <w:rPr>
+          <w:color w:val="334155"/>
+        </w:rPr>
+        <w:t>Penalizes cells with substation distance &gt; 1,500 m; categorizes candidate sites into Tier-1 Feeder Ready (≥ 500 kVA spare capacity), Tier-2 (150–250 kVA), and Tier-3 (constrained).</w:t>
+      </w:r>
+    </w:p>
+    <w:p>
+      <w:pPr>
+        <w:pStyle w:val="ListBullet"/>
+      </w:pPr>
+      <w:r>
+        <w:rPr>
+          <w:b/>
+          <w:color w:val="0F172A"/>
+        </w:rPr>
+        <w:t xml:space="preserve">Constraint 2 (Anti-Cannibalization / Dispersion): </w:t>
+      </w:r>
+      <w:r>
+        <w:rPr>
+          <w:color w:val="334155"/>
+        </w:rPr>
+        <w:t>Mandates that all selected candidate hubs maintain a minimum spatial distance ≥ 1.2 km from one another.</w:t>
+      </w:r>
+    </w:p>
+    <w:p>
+      <w:pPr>
+        <w:keepNext/>
+        <w:spacing w:before="200" w:after="60"/>
+      </w:pPr>
+      <w:r>
+        <w:rPr>
+          <w:rFonts w:ascii="Arial" w:hAnsi="Arial"/>
+          <w:b/>
+          <w:color w:val="0F766E"/>
+          <w:sz w:val="23"/>
+        </w:rPr>
+        <w:t>C3. Demand and Requirement Estimation (✅ scripts/train_ai_models.py + src/utils/planningEngine.ts)</w:t>
+      </w:r>
+    </w:p>
+    <w:p>
+      <w:pPr>
+        <w:keepNext/>
+        <w:spacing w:before="160" w:after="40"/>
+      </w:pPr>
+      <w:r>
+        <w:rPr>
+          <w:rFonts w:ascii="Arial" w:hAnsi="Arial"/>
+          <w:b/>
+          <w:color w:val="1E293B"/>
+          <w:sz w:val="21"/>
+        </w:rPr>
+        <w:t>1. Predictive Fleet Forecasting: Bass Diffusion Model of Innovation Adoption</w:t>
+      </w:r>
+    </w:p>
+    <w:p>
+      <w:r>
+        <w:t>Rather than relying on static linear growth multipliers, GridSight EV fits the Bass Diffusion Model to 68 months of historical VAHAN registration data (2018–2026):</w:t>
+      </w:r>
+    </w:p>
+    <w:tbl>
+      <w:tblPr>
+        <w:tblW w:type="auto" w:w="0"/>
+        <w:jc w:val="center"/>
+        <w:tblLayout w:type="fixed"/>
+        <w:tblLook w:firstColumn="1" w:firstRow="1" w:lastColumn="0" w:lastRow="0" w:noHBand="0" w:noVBand="1" w:val="04A0"/>
+      </w:tblPr>
+      <w:tblGrid>
+        <w:gridCol w:w="10080"/>
+      </w:tblGrid>
+      <w:tr>
+        <w:tc>
+          <w:tcPr>
+            <w:tcW w:type="dxa" w:w="10080"/>
+            <w:shd w:fill="F0FDFA"/>
+            <w:tcMar>
+              <w:top w:w="140" w:type="dxa"/>
+              <w:bottom w:w="140" w:type="dxa"/>
+              <w:left w:w="200" w:type="dxa"/>
+              <w:right w:w="200" w:type="dxa"/>
+            </w:tcMar>
+            <w:tcBorders>
+              <w:top w:val="single" w:sz="4" w:space="0" w:color="CCFBF1"/>
+              <w:left w:val="single" w:sz="24" w:space="0" w:color="0F766E"/>
+              <w:bottom w:val="single" w:sz="4" w:space="0" w:color="CCFBF1"/>
+              <w:right w:val="single" w:sz="4" w:space="0" w:color="CCFBF1"/>
+            </w:tcBorders>
+          </w:tcPr>
+          <w:p>
+            <w:pPr>
+              <w:spacing w:before="40" w:after="80"/>
+            </w:pPr>
+            <w:r>
+              <w:rPr>
+                <w:rFonts w:ascii="Arial" w:hAnsi="Arial"/>
+                <w:b/>
+                <w:color w:val="0F766E"/>
+                <w:sz w:val="18"/>
+              </w:rPr>
+              <w:t>FORMULA SPECIFICATION: Bass Diffusion Technology Adoption Model [Eq. 5A]</w:t>
+              <w:br/>
+            </w:r>
+            <w:r>
+              <w:rPr>
+                <w:rFonts w:ascii="Cambria Math" w:hAnsi="Cambria Math"/>
+                <w:b/>
+                <w:color w:val="0F172A"/>
+                <w:sz w:val="22"/>
+              </w:rPr>
+              <w:t>S(t) = dN(t)/dt = [ p + (q / M) N(t) ] [ M - N(t) ]</w:t>
+              <w:br/>
+            </w:r>
+            <w:r>
+              <w:rPr>
+                <w:rFonts w:ascii="Arial" w:hAnsi="Arial"/>
+                <w:color w:val="475569"/>
+                <w:sz w:val="18"/>
+              </w:rPr>
+              <w:t>Calibrated Parameters (Non-linear Least Squares, R² = 0.992):</w:t>
+              <w:br/>
+              <w:t>• Innovation Coefficient (p): 0.0114 (external policy and early technology adopters)</w:t>
+              <w:br/>
+              <w:t>• Imitation Coefficient (q): 0.4963 (internal peer effects and charging network density)</w:t>
+              <w:br/>
+              <w:t>• National Market Ceiling (M): 20.0 Million EVs</w:t>
+              <w:br/>
+              <w:br/>
+              <w:t>S-Curve Projections with Stochastic Confidence Bands (P10 to P90):</w:t>
+              <w:br/>
+              <w:t>• 2026 Baseline: National 11.23M EVs (P10: 8.16M, P90: 14.54M); Delhi active fleet 577,295 EVs.</w:t>
+              <w:br/>
+              <w:t>• 2028 Trajectory: National 15.63M EVs (P10: 12.23M, P90: 18.71M); Delhi active fleet 803,300 EVs.</w:t>
+              <w:br/>
+              <w:t>• 2030 Horizon: National 18.17M EVs (P10: 15.27M, P90: 20.58M); Delhi active fleet 933,751 EVs.</w:t>
+            </w:r>
+          </w:p>
+        </w:tc>
+      </w:tr>
+    </w:tbl>
+    <w:p>
+      <w:pPr>
+        <w:spacing w:after="40"/>
+      </w:pPr>
+    </w:p>
+    <w:p>
+      <w:pPr>
+        <w:keepNext/>
+        <w:spacing w:before="160" w:after="40"/>
+      </w:pPr>
+      <w:r>
+        <w:rPr>
+          <w:rFonts w:ascii="Arial" w:hAnsi="Arial"/>
+          <w:b/>
+          <w:color w:val="1E293B"/>
+          <w:sz w:val="21"/>
+        </w:rPr>
+        <w:t>2. Daily Public Energy Demand Balance</w:t>
+      </w:r>
+    </w:p>
+    <w:p>
+      <w:r>
+        <w:t>For vehicle class k ∈ {2W, 3W, 4W, Bus, Goods}:</w:t>
+      </w:r>
+    </w:p>
+    <w:p>
+      <w:pPr>
+        <w:pStyle w:val="ListBullet"/>
+      </w:pPr>
+      <w:r>
+        <w:rPr>
+          <w:b/>
+          <w:color w:val="0F172A"/>
+        </w:rPr>
+        <w:t xml:space="preserve">Daily Public Energy Equation [Eq. 5B]: </w:t>
+      </w:r>
+      <w:r>
+        <w:rPr>
+          <w:color w:val="334155"/>
+        </w:rPr>
+        <w:t>E_k = V_k,2030 × e_k × φ_k,s (kWh/day)</w:t>
+      </w:r>
+    </w:p>
+    <w:p>
+      <w:pPr>
+        <w:pStyle w:val="ListBullet"/>
+      </w:pPr>
+      <w:r>
+        <w:rPr>
+          <w:b/>
+          <w:color w:val="0F172A"/>
+        </w:rPr>
+        <w:t xml:space="preserve">Verified Daily Consumption Rates e_k: </w:t>
+      </w:r>
+      <w:r>
+        <w:rPr>
+          <w:color w:val="334155"/>
+        </w:rPr>
+        <w:t>2W (1.024 kWh: 32 km/day × 0.032 kWh/km), 3W (6.375 kWh: 85 km/day × 0.075 kWh/km), 4W (6.96 kWh: 48 km/day × 0.145 kWh/km), Bus (207 kWh: 180 km/day × 1.15 kWh/km), and Goods (13.5 kWh: 90 km/day × 0.15 kWh/km).</w:t>
+      </w:r>
+    </w:p>
+    <w:p>
+      <w:pPr>
+        <w:pStyle w:val="ListBullet"/>
+      </w:pPr>
+      <w:r>
+        <w:rPr>
+          <w:b/>
+          <w:color w:val="0F172A"/>
+        </w:rPr>
+        <w:t xml:space="preserve">Baseline Public Reliance Shares φ_k,s: </w:t>
+      </w:r>
+      <w:r>
+        <w:rPr>
+          <w:color w:val="334155"/>
+        </w:rPr>
+        <w:t>20% (2W), 55% (3W), 32% (4W), 20% (Bus), 50% (Goods).</w:t>
+      </w:r>
+    </w:p>
+    <w:p>
+      <w:pPr>
+        <w:pStyle w:val="ListBullet"/>
+      </w:pPr>
+      <w:r>
+        <w:rPr>
+          <w:b/>
+          <w:color w:val="0F172A"/>
+        </w:rPr>
+        <w:t xml:space="preserve">Battery Swapping Allocation: </w:t>
+      </w:r>
+      <w:r>
+        <w:rPr>
+          <w:color w:val="334155"/>
+        </w:rPr>
+        <w:t>Swapping absorbs σ_s of 2W/3W public energy (Low: 28%, Baseline: 35%, High: 40%). Remaining plug-in energy is split: 2W/3W (85% AC / 15% DC), 4W (35% AC / 65% DC), Goods (25% AC / 75% DC), Bus (100% DC).</w:t>
+      </w:r>
+    </w:p>
+    <w:p>
+      <w:pPr>
+        <w:pStyle w:val="ListBullet"/>
+      </w:pPr>
+      <w:r>
+        <w:rPr>
+          <w:b/>
+          <w:color w:val="0F172A"/>
+        </w:rPr>
+        <w:t xml:space="preserve">Daily Connector Throughput: </w:t>
+      </w:r>
+      <w:r>
+        <w:rPr>
+          <w:color w:val="334155"/>
+        </w:rPr>
+        <w:t>AC Connector = 4.2 kW × 5.5 utilization hours = 23.1 kWh/day; DC Fast Nozzle = 30.0 kW × 6.0 utilization hours = 180.0 kWh/day; Swap Docket = 12.5 swaps/day × 2.1 kWh/swap = 26.25 kWh/day.</w:t>
+      </w:r>
+    </w:p>
+    <w:tbl>
+      <w:tblPr>
+        <w:tblW w:type="auto" w:w="0"/>
+        <w:jc w:val="center"/>
+        <w:tblLayout w:type="fixed"/>
+        <w:tblLook w:firstColumn="1" w:firstRow="1" w:lastColumn="0" w:lastRow="0" w:noHBand="0" w:noVBand="1" w:val="04A0"/>
+      </w:tblPr>
+      <w:tblGrid>
+        <w:gridCol w:w="10080"/>
+      </w:tblGrid>
+      <w:tr>
+        <w:tc>
+          <w:tcPr>
+            <w:tcW w:type="dxa" w:w="10080"/>
+            <w:shd w:fill="F0FDFA"/>
+            <w:tcMar>
+              <w:top w:w="140" w:type="dxa"/>
+              <w:bottom w:w="140" w:type="dxa"/>
+              <w:left w:w="200" w:type="dxa"/>
+              <w:right w:w="200" w:type="dxa"/>
+            </w:tcMar>
+            <w:tcBorders>
+              <w:top w:val="single" w:sz="4" w:space="0" w:color="CCFBF1"/>
+              <w:left w:val="single" w:sz="24" w:space="0" w:color="0F766E"/>
+              <w:bottom w:val="single" w:sz="4" w:space="0" w:color="CCFBF1"/>
+              <w:right w:val="single" w:sz="4" w:space="0" w:color="CCFBF1"/>
+            </w:tcBorders>
+          </w:tcPr>
+          <w:p>
+            <w:pPr>
+              <w:spacing w:before="40" w:after="80"/>
+            </w:pPr>
+            <w:r>
+              <w:rPr>
+                <w:rFonts w:ascii="Arial" w:hAnsi="Arial"/>
+                <w:b/>
+                <w:color w:val="0F766E"/>
+                <w:sz w:val="18"/>
+              </w:rPr>
+              <w:t>FORMULA SPECIFICATION: Hardware Quantification &amp; Net New Requirements [Eq. 6 &amp; Eq. 7]</w:t>
+              <w:br/>
+            </w:r>
+            <w:r>
+              <w:rPr>
+                <w:rFonts w:ascii="Cambria Math" w:hAnsi="Cambria Math"/>
+                <w:b/>
+                <w:color w:val="0F172A"/>
+                <w:sz w:val="22"/>
+              </w:rPr>
+              <w:t>N = ceil(E / Throughput)</w:t>
+              <w:br/>
+              <w:t>Charging Points (EVSE) = AC + ceil(DC / 1.35)</w:t>
+              <w:br/>
+              <w:t>Stations = ceil(Points / 4.5)  [Eq. 6]</w:t>
+              <w:br/>
+              <w:br/>
+              <w:t>Net New Hardware = max(0, Required - Σ Existing Installed × η_power)  [Eq. 7]</w:t>
+              <w:br/>
+            </w:r>
+            <w:r>
+              <w:rPr>
+                <w:rFonts w:ascii="Arial" w:hAnsi="Arial"/>
+                <w:color w:val="475569"/>
+                <w:sz w:val="18"/>
+              </w:rPr>
+              <w:t>Power-Tier Substitution Matrix (η_power): To prevent legacy slow 3.3 kW AC sockets from offsetting high-power DC fast requirements, η_power = 1.0 when power matches or exceeds the required tier, η_power = 0.15 for slow sockets evaluated against slow AC targets, and η_power = 0.00 when slow sockets are evaluated against DC fast charging requirements.</w:t>
+            </w:r>
+          </w:p>
+        </w:tc>
+      </w:tr>
+    </w:tbl>
+    <w:p>
+      <w:pPr>
+        <w:spacing w:after="40"/>
+      </w:pPr>
     </w:p>
     <w:p>
       <w:pPr>
@@ -1173,7 +1582,7 @@
           <w:color w:val="0F172A"/>
           <w:sz w:val="28"/>
         </w:rPr>
-        <w:t>D. Data strategy and provenance</w:t>
+        <w:t>D. Data Strategy and Provenance (10%)</w:t>
       </w:r>
     </w:p>
     <w:p>
@@ -3043,7 +3452,7 @@
           <w:color w:val="0F172A"/>
           <w:sz w:val="28"/>
         </w:rPr>
-        <w:t>E. Technical architecture and tools</w:t>
+        <w:t>E. Technical Architecture and Tools</w:t>
       </w:r>
     </w:p>
     <w:p>
@@ -3133,7 +3542,7 @@
         <w:rPr>
           <w:color w:val="334155"/>
         </w:rPr>
-        <w:t>A research-grade light interface featuring five dedicated views: Delhi Pilot Map (876 stations), Coverage Planning (375-cell grid and 2030 simulator), AI &amp; Optimization Studio (Random Forest regressor, Bass diffusion curves, and constrained siting optimizer), Data &amp; Methodology Audit (reconciliation matrix), and National Overview (36-state choropleths and 776 BEE district hub clusters).</w:t>
+        <w:t>A research-grade light interface featuring five dedicated views: 1. Delhi Pilot Map (876 charging &amp; swapping locations), 2. Coverage Planning (375-cell spatial coverage map and 2030 future capacity simulator), 3. AI &amp; Optimization Studio (Supervised Spatial Demand ML Regressor, Bass Diffusion S-curve adoption curves, and interactive Constrained Siting Optimizer), 4. Data &amp; Methodology Audit (complete non-additivity reconciliation matrix and external data gap register), and 5. National Overview (36-state EV demand choropleths, 776 BEE district hub clusters, and state deep-dive profiles).</w:t>
       </w:r>
     </w:p>
     <w:p>
@@ -3148,7 +3557,7 @@
           <w:color w:val="0F172A"/>
           <w:sz w:val="28"/>
         </w:rPr>
-        <w:t>F. Validation, QA and current evidence status</w:t>
+        <w:t>F. Validation, QA and Current Evidence Status</w:t>
       </w:r>
     </w:p>
     <w:tbl>
@@ -3318,7 +3727,7 @@
               <w:rPr>
                 <w:sz w:val="17"/>
               </w:rPr>
-              <w:t>28 automated checks (36 states, 10.69M EVs, 39,641 BEE rows, 44,066 connectors, OMC 27,737/22,753, FAME-II 8,932, Delhi 9 districts / 23 RTOs / 549,153 EVs, 876 Switch Delhi, 375 grid cells; AI ML R²&gt;0.70; Bass R²&gt;0.95; Optimizer 25 sites)</w:t>
+              <w:t>28 automated checks (36 states, 10.69M EVs, 39,641 BEE rows, 44,066 connectors, OMC 27,737/22,753, FAME-II 8,932, Delhi 9 districts / 23 RTOs / 549,153 EVs, 876 Switch Delhi, 375 grid cells; AI ML R² &gt; 0.70; Bass R² &gt; 0.95; Optimizer 25 sites)</w:t>
             </w:r>
           </w:p>
         </w:tc>
@@ -3676,17 +4085,27 @@
           <w:color w:val="0F172A"/>
           <w:sz w:val="28"/>
         </w:rPr>
-        <w:t>G. Innovation and differentiation — Explainable Spatial AI (PIML)</w:t>
+        <w:t>G. Innovation and Differentiation — Explainable Spatial AI (PIML)</w:t>
+      </w:r>
+    </w:p>
+    <w:p>
+      <w:pPr>
+        <w:keepNext/>
+        <w:spacing w:before="200" w:after="60"/>
+      </w:pPr>
+      <w:r>
+        <w:rPr>
+          <w:rFonts w:ascii="Arial" w:hAnsi="Arial"/>
+          <w:b/>
+          <w:color w:val="0F766E"/>
+          <w:sz w:val="23"/>
+        </w:rPr>
+        <w:t>Explainable &amp; Physics-Informed Spatial AI vs. Black-Box Neural Networks</w:t>
       </w:r>
     </w:p>
     <w:p>
       <w:r>
-        <w:t>Explainable &amp; Physics-Informed Spatial AI vs. Black-Box Neural Networks: Public sector infrastructure planning requires institutional auditability before public finance bodies (MHI, NITI Aayog, ICAT). A black-box deep neural network that hallucinates coordinates without explaining why an unserved municipal ward was bypassed cannot be operationalized in government tenders. GridSight EV deploys an Explainable, Physics-Informed Spatial AI (PIML) Suite:</w:t>
-      </w:r>
-    </w:p>
-    <w:p>
-      <w:r>
-        <w:t>What Is Claimed and Verifiable in Repo:</w:t>
+        <w:t>Public sector infrastructure planning requires institutional auditability before public finance bodies (MHI, NITI Aayog, ICAT). A black-box deep neural network that hallucinates coordinates without explaining why an unserved municipal ward was bypassed cannot be operationalized in government tenders. GridSight EV deploys an Explainable, Physics-Informed Spatial AI (PIML) Suite:</w:t>
       </w:r>
     </w:p>
     <w:p>
@@ -3722,7 +4141,7 @@
         <w:rPr>
           <w:color w:val="334155"/>
         </w:rPr>
-        <w:t>Solves the non-linear differential equation of technology diffusion (R² = 0.992, p=0.0114, q=0.4963, M=20.0M EVs) on monthly VAHAN data, capturing adoption inflection points and stochastic P10/P90 uncertainty bands.</w:t>
+        <w:t>Solves the non-linear differential equation of technology diffusion (R² = 0.992, p = 0.0114, q = 0.4963, M = 20.0M EVs) on monthly VAHAN data, capturing adoption inflection points and stochastic P10/P90 uncertainty bands.</w:t>
       </w:r>
     </w:p>
     <w:p>
@@ -3740,7 +4159,7 @@
         <w:rPr>
           <w:color w:val="334155"/>
         </w:rPr>
-        <w:t>An integer programming / submodular greedy optimizer selecting candidate infill plazas bounded by DISCOM feeder proximity (&lt;1,500m) and spatial anti-cannibalization spacing (≥1.2km).</w:t>
+        <w:t>An integer programming / submodular greedy optimizer selecting candidate infill plazas bounded by DISCOM feeder proximity (&lt; 1,500 m) and spatial anti-cannibalization spacing (≥ 1.2 km).</w:t>
       </w:r>
     </w:p>
     <w:p>
@@ -3758,7 +4177,7 @@
         <w:rPr>
           <w:color w:val="334155"/>
         </w:rPr>
-        <w:t>We prevent the critical industry error of adding overlapping registries. BEE, Switch Delhi, OMC, and OSM are separately selectable baselines.</w:t>
+        <w:t>Prevents the critical industry error of adding overlapping registries. BEE, Switch Delhi, OMC, and OSM are separately selectable baselines.</w:t>
       </w:r>
     </w:p>
     <w:p>
@@ -3791,7 +4210,7 @@
           <w:color w:val="0F172A"/>
           <w:sz w:val="28"/>
         </w:rPr>
-        <w:t>H. Implementation roadmap</w:t>
+        <w:t>H. Implementation Roadmap</w:t>
       </w:r>
     </w:p>
     <w:tbl>
@@ -4136,7 +4555,7 @@
           <w:color w:val="0F172A"/>
           <w:sz w:val="28"/>
         </w:rPr>
-        <w:t>I. Limitations and risks</w:t>
+        <w:t>I. Limitations and Risks</w:t>
       </w:r>
     </w:p>
     <w:tbl>
@@ -4584,7 +5003,7 @@
               <w:rPr>
                 <w:sz w:val="17"/>
               </w:rPr>
-              <w:t>All processed GeoJSON boundaries, district joins, and spatial tables are bundled locally in public/data/.</w:t>
+              <w:t>All processed GeoJSON boundaries, district joins, spatial tables, and AI bundles are bundled locally in public/data/.</w:t>
             </w:r>
           </w:p>
         </w:tc>
@@ -4743,7 +5162,7 @@
           <w:color w:val="0F172A"/>
           <w:sz w:val="28"/>
         </w:rPr>
-        <w:t>K. Criteria cross-reference matrix</w:t>
+        <w:t>K. Criteria Cross-Reference Matrix</w:t>
       </w:r>
     </w:p>
     <w:tbl>

</xml_diff>

<commit_message>
Fix Word XML schema compliance by ordering tcPr and tblPr child elements according to ECMA-376
</commit_message>
<xml_diff>
--- a/TECHFEST_SUBMISSION_ROUND_1.docx
+++ b/TECHFEST_SUBMISSION_ROUND_1.docx
@@ -97,7 +97,6 @@
       <w:tblPr>
         <w:tblW w:type="auto" w:w="0"/>
         <w:jc w:val="center"/>
-        <w:tblLook w:firstColumn="1" w:firstRow="1" w:lastColumn="0" w:lastRow="0" w:noHBand="0" w:noVBand="1" w:val="04A0"/>
         <w:tblBorders>
           <w:top w:val="single" w:sz="4" w:space="0" w:color="CBD5E1"/>
           <w:bottom w:val="single" w:sz="4" w:space="0" w:color="CBD5E1"/>
@@ -106,6 +105,7 @@
           <w:insideH w:val="single" w:sz="4" w:space="0" w:color="CBD5E1"/>
           <w:insideV w:val="none"/>
         </w:tblBorders>
+        <w:tblLook w:firstColumn="1" w:firstRow="1" w:lastColumn="0" w:lastRow="0" w:noHBand="0" w:noVBand="1" w:val="04A0"/>
       </w:tblPr>
       <w:tblGrid>
         <w:gridCol w:w="3600"/>
@@ -159,13 +159,13 @@
         <w:tc>
           <w:tcPr>
             <w:tcW w:type="dxa" w:w="5040"/>
+            <w:shd w:fill="F8FAFC"/>
             <w:tcMar>
               <w:top w:w="80" w:type="dxa"/>
               <w:bottom w:w="80" w:type="dxa"/>
               <w:left w:w="140" w:type="dxa"/>
               <w:right w:w="140" w:type="dxa"/>
             </w:tcMar>
-            <w:shd w:fill="F8FAFC"/>
           </w:tcPr>
           <w:p>
             <w:r>
@@ -179,13 +179,13 @@
         <w:tc>
           <w:tcPr>
             <w:tcW w:type="dxa" w:w="5040"/>
+            <w:shd w:fill="F8FAFC"/>
             <w:tcMar>
               <w:top w:w="80" w:type="dxa"/>
               <w:bottom w:w="80" w:type="dxa"/>
               <w:left w:w="140" w:type="dxa"/>
               <w:right w:w="140" w:type="dxa"/>
             </w:tcMar>
-            <w:shd w:fill="F8FAFC"/>
           </w:tcPr>
           <w:p>
             <w:r>
@@ -241,13 +241,13 @@
         <w:tc>
           <w:tcPr>
             <w:tcW w:type="dxa" w:w="5040"/>
+            <w:shd w:fill="F8FAFC"/>
             <w:tcMar>
               <w:top w:w="80" w:type="dxa"/>
               <w:bottom w:w="80" w:type="dxa"/>
               <w:left w:w="140" w:type="dxa"/>
               <w:right w:w="140" w:type="dxa"/>
             </w:tcMar>
-            <w:shd w:fill="F8FAFC"/>
           </w:tcPr>
           <w:p>
             <w:r>
@@ -261,13 +261,13 @@
         <w:tc>
           <w:tcPr>
             <w:tcW w:type="dxa" w:w="5040"/>
+            <w:shd w:fill="F8FAFC"/>
             <w:tcMar>
               <w:top w:w="80" w:type="dxa"/>
               <w:bottom w:w="80" w:type="dxa"/>
               <w:left w:w="140" w:type="dxa"/>
               <w:right w:w="140" w:type="dxa"/>
             </w:tcMar>
-            <w:shd w:fill="F8FAFC"/>
           </w:tcPr>
           <w:p>
             <w:r>
@@ -649,6 +649,12 @@
         <w:tc>
           <w:tcPr>
             <w:tcW w:type="dxa" w:w="10080"/>
+            <w:tcBorders>
+              <w:top w:val="single" w:sz="4" w:space="0" w:color="CCFBF1"/>
+              <w:left w:val="single" w:sz="24" w:space="0" w:color="0F766E"/>
+              <w:bottom w:val="single" w:sz="4" w:space="0" w:color="CCFBF1"/>
+              <w:right w:val="single" w:sz="4" w:space="0" w:color="CCFBF1"/>
+            </w:tcBorders>
             <w:shd w:fill="F0FDFA"/>
             <w:tcMar>
               <w:top w:w="140" w:type="dxa"/>
@@ -656,12 +662,6 @@
               <w:left w:w="200" w:type="dxa"/>
               <w:right w:w="200" w:type="dxa"/>
             </w:tcMar>
-            <w:tcBorders>
-              <w:top w:val="single" w:sz="4" w:space="0" w:color="CCFBF1"/>
-              <w:left w:val="single" w:sz="24" w:space="0" w:color="0F766E"/>
-              <w:bottom w:val="single" w:sz="4" w:space="0" w:color="CCFBF1"/>
-              <w:right w:val="single" w:sz="4" w:space="0" w:color="CCFBF1"/>
-            </w:tcBorders>
           </w:tcPr>
           <w:p>
             <w:pPr>
@@ -951,6 +951,12 @@
         <w:tc>
           <w:tcPr>
             <w:tcW w:type="dxa" w:w="10080"/>
+            <w:tcBorders>
+              <w:top w:val="single" w:sz="4" w:space="0" w:color="CCFBF1"/>
+              <w:left w:val="single" w:sz="24" w:space="0" w:color="0F766E"/>
+              <w:bottom w:val="single" w:sz="4" w:space="0" w:color="CCFBF1"/>
+              <w:right w:val="single" w:sz="4" w:space="0" w:color="CCFBF1"/>
+            </w:tcBorders>
             <w:shd w:fill="F0FDFA"/>
             <w:tcMar>
               <w:top w:w="140" w:type="dxa"/>
@@ -958,12 +964,6 @@
               <w:left w:w="200" w:type="dxa"/>
               <w:right w:w="200" w:type="dxa"/>
             </w:tcMar>
-            <w:tcBorders>
-              <w:top w:val="single" w:sz="4" w:space="0" w:color="CCFBF1"/>
-              <w:left w:val="single" w:sz="24" w:space="0" w:color="0F766E"/>
-              <w:bottom w:val="single" w:sz="4" w:space="0" w:color="CCFBF1"/>
-              <w:right w:val="single" w:sz="4" w:space="0" w:color="CCFBF1"/>
-            </w:tcBorders>
           </w:tcPr>
           <w:p>
             <w:pPr>
@@ -1040,6 +1040,12 @@
         <w:tc>
           <w:tcPr>
             <w:tcW w:type="dxa" w:w="10080"/>
+            <w:tcBorders>
+              <w:top w:val="single" w:sz="4" w:space="0" w:color="CCFBF1"/>
+              <w:left w:val="single" w:sz="24" w:space="0" w:color="0F766E"/>
+              <w:bottom w:val="single" w:sz="4" w:space="0" w:color="CCFBF1"/>
+              <w:right w:val="single" w:sz="4" w:space="0" w:color="CCFBF1"/>
+            </w:tcBorders>
             <w:shd w:fill="F0FDFA"/>
             <w:tcMar>
               <w:top w:w="140" w:type="dxa"/>
@@ -1047,12 +1053,6 @@
               <w:left w:w="200" w:type="dxa"/>
               <w:right w:w="200" w:type="dxa"/>
             </w:tcMar>
-            <w:tcBorders>
-              <w:top w:val="single" w:sz="4" w:space="0" w:color="CCFBF1"/>
-              <w:left w:val="single" w:sz="24" w:space="0" w:color="0F766E"/>
-              <w:bottom w:val="single" w:sz="4" w:space="0" w:color="CCFBF1"/>
-              <w:right w:val="single" w:sz="4" w:space="0" w:color="CCFBF1"/>
-            </w:tcBorders>
           </w:tcPr>
           <w:p>
             <w:pPr>
@@ -1129,6 +1129,12 @@
         <w:tc>
           <w:tcPr>
             <w:tcW w:type="dxa" w:w="10080"/>
+            <w:tcBorders>
+              <w:top w:val="single" w:sz="4" w:space="0" w:color="CCFBF1"/>
+              <w:left w:val="single" w:sz="24" w:space="0" w:color="0F766E"/>
+              <w:bottom w:val="single" w:sz="4" w:space="0" w:color="CCFBF1"/>
+              <w:right w:val="single" w:sz="4" w:space="0" w:color="CCFBF1"/>
+            </w:tcBorders>
             <w:shd w:fill="F0FDFA"/>
             <w:tcMar>
               <w:top w:w="140" w:type="dxa"/>
@@ -1136,12 +1142,6 @@
               <w:left w:w="200" w:type="dxa"/>
               <w:right w:w="200" w:type="dxa"/>
             </w:tcMar>
-            <w:tcBorders>
-              <w:top w:val="single" w:sz="4" w:space="0" w:color="CCFBF1"/>
-              <w:left w:val="single" w:sz="24" w:space="0" w:color="0F766E"/>
-              <w:bottom w:val="single" w:sz="4" w:space="0" w:color="CCFBF1"/>
-              <w:right w:val="single" w:sz="4" w:space="0" w:color="CCFBF1"/>
-            </w:tcBorders>
           </w:tcPr>
           <w:p>
             <w:pPr>
@@ -1314,6 +1314,12 @@
         <w:tc>
           <w:tcPr>
             <w:tcW w:type="dxa" w:w="10080"/>
+            <w:tcBorders>
+              <w:top w:val="single" w:sz="4" w:space="0" w:color="CCFBF1"/>
+              <w:left w:val="single" w:sz="24" w:space="0" w:color="0F766E"/>
+              <w:bottom w:val="single" w:sz="4" w:space="0" w:color="CCFBF1"/>
+              <w:right w:val="single" w:sz="4" w:space="0" w:color="CCFBF1"/>
+            </w:tcBorders>
             <w:shd w:fill="F0FDFA"/>
             <w:tcMar>
               <w:top w:w="140" w:type="dxa"/>
@@ -1321,12 +1327,6 @@
               <w:left w:w="200" w:type="dxa"/>
               <w:right w:w="200" w:type="dxa"/>
             </w:tcMar>
-            <w:tcBorders>
-              <w:top w:val="single" w:sz="4" w:space="0" w:color="CCFBF1"/>
-              <w:left w:val="single" w:sz="24" w:space="0" w:color="0F766E"/>
-              <w:bottom w:val="single" w:sz="4" w:space="0" w:color="CCFBF1"/>
-              <w:right w:val="single" w:sz="4" w:space="0" w:color="CCFBF1"/>
-            </w:tcBorders>
           </w:tcPr>
           <w:p>
             <w:pPr>
@@ -1508,6 +1508,12 @@
         <w:tc>
           <w:tcPr>
             <w:tcW w:type="dxa" w:w="10080"/>
+            <w:tcBorders>
+              <w:top w:val="single" w:sz="4" w:space="0" w:color="CCFBF1"/>
+              <w:left w:val="single" w:sz="24" w:space="0" w:color="0F766E"/>
+              <w:bottom w:val="single" w:sz="4" w:space="0" w:color="CCFBF1"/>
+              <w:right w:val="single" w:sz="4" w:space="0" w:color="CCFBF1"/>
+            </w:tcBorders>
             <w:shd w:fill="F0FDFA"/>
             <w:tcMar>
               <w:top w:w="140" w:type="dxa"/>
@@ -1515,12 +1521,6 @@
               <w:left w:w="200" w:type="dxa"/>
               <w:right w:w="200" w:type="dxa"/>
             </w:tcMar>
-            <w:tcBorders>
-              <w:top w:val="single" w:sz="4" w:space="0" w:color="CCFBF1"/>
-              <w:left w:val="single" w:sz="24" w:space="0" w:color="0F766E"/>
-              <w:bottom w:val="single" w:sz="4" w:space="0" w:color="CCFBF1"/>
-              <w:right w:val="single" w:sz="4" w:space="0" w:color="CCFBF1"/>
-            </w:tcBorders>
           </w:tcPr>
           <w:p>
             <w:pPr>
@@ -1594,7 +1594,6 @@
       <w:tblPr>
         <w:tblW w:type="auto" w:w="0"/>
         <w:jc w:val="center"/>
-        <w:tblLook w:firstColumn="1" w:firstRow="1" w:lastColumn="0" w:lastRow="0" w:noHBand="0" w:noVBand="1" w:val="04A0"/>
         <w:tblBorders>
           <w:top w:val="single" w:sz="4" w:space="0" w:color="CBD5E1"/>
           <w:bottom w:val="single" w:sz="4" w:space="0" w:color="CBD5E1"/>
@@ -1603,6 +1602,7 @@
           <w:insideH w:val="single" w:sz="4" w:space="0" w:color="CBD5E1"/>
           <w:insideV w:val="none"/>
         </w:tblBorders>
+        <w:tblLook w:firstColumn="1" w:firstRow="1" w:lastColumn="0" w:lastRow="0" w:noHBand="0" w:noVBand="1" w:val="04A0"/>
       </w:tblPr>
       <w:tblGrid>
         <w:gridCol w:w="1152"/>
@@ -1750,13 +1750,13 @@
         <w:tc>
           <w:tcPr>
             <w:tcW w:type="dxa" w:w="1680"/>
+            <w:shd w:fill="F8FAFC"/>
             <w:tcMar>
               <w:top w:w="60" w:type="dxa"/>
               <w:bottom w:w="60" w:type="dxa"/>
               <w:left w:w="80" w:type="dxa"/>
               <w:right w:w="80" w:type="dxa"/>
             </w:tcMar>
-            <w:shd w:fill="F8FAFC"/>
           </w:tcPr>
           <w:p>
             <w:r>
@@ -1770,13 +1770,13 @@
         <w:tc>
           <w:tcPr>
             <w:tcW w:type="dxa" w:w="1680"/>
+            <w:shd w:fill="F8FAFC"/>
             <w:tcMar>
               <w:top w:w="60" w:type="dxa"/>
               <w:bottom w:w="60" w:type="dxa"/>
               <w:left w:w="80" w:type="dxa"/>
               <w:right w:w="80" w:type="dxa"/>
             </w:tcMar>
-            <w:shd w:fill="F8FAFC"/>
           </w:tcPr>
           <w:p>
             <w:r>
@@ -1790,13 +1790,13 @@
         <w:tc>
           <w:tcPr>
             <w:tcW w:type="dxa" w:w="1680"/>
+            <w:shd w:fill="F8FAFC"/>
             <w:tcMar>
               <w:top w:w="60" w:type="dxa"/>
               <w:bottom w:w="60" w:type="dxa"/>
               <w:left w:w="80" w:type="dxa"/>
               <w:right w:w="80" w:type="dxa"/>
             </w:tcMar>
-            <w:shd w:fill="F8FAFC"/>
           </w:tcPr>
           <w:p>
             <w:r>
@@ -1810,13 +1810,13 @@
         <w:tc>
           <w:tcPr>
             <w:tcW w:type="dxa" w:w="1680"/>
+            <w:shd w:fill="F8FAFC"/>
             <w:tcMar>
               <w:top w:w="60" w:type="dxa"/>
               <w:bottom w:w="60" w:type="dxa"/>
               <w:left w:w="80" w:type="dxa"/>
               <w:right w:w="80" w:type="dxa"/>
             </w:tcMar>
-            <w:shd w:fill="F8FAFC"/>
           </w:tcPr>
           <w:p>
             <w:r>
@@ -1830,13 +1830,13 @@
         <w:tc>
           <w:tcPr>
             <w:tcW w:type="dxa" w:w="1680"/>
+            <w:shd w:fill="F8FAFC"/>
             <w:tcMar>
               <w:top w:w="60" w:type="dxa"/>
               <w:bottom w:w="60" w:type="dxa"/>
               <w:left w:w="80" w:type="dxa"/>
               <w:right w:w="80" w:type="dxa"/>
             </w:tcMar>
-            <w:shd w:fill="F8FAFC"/>
           </w:tcPr>
           <w:p>
             <w:r>
@@ -1850,13 +1850,13 @@
         <w:tc>
           <w:tcPr>
             <w:tcW w:type="dxa" w:w="1680"/>
+            <w:shd w:fill="F8FAFC"/>
             <w:tcMar>
               <w:top w:w="60" w:type="dxa"/>
               <w:bottom w:w="60" w:type="dxa"/>
               <w:left w:w="80" w:type="dxa"/>
               <w:right w:w="80" w:type="dxa"/>
             </w:tcMar>
-            <w:shd w:fill="F8FAFC"/>
           </w:tcPr>
           <w:p>
             <w:r>
@@ -1988,13 +1988,13 @@
         <w:tc>
           <w:tcPr>
             <w:tcW w:type="dxa" w:w="1680"/>
+            <w:shd w:fill="F8FAFC"/>
             <w:tcMar>
               <w:top w:w="60" w:type="dxa"/>
               <w:bottom w:w="60" w:type="dxa"/>
               <w:left w:w="80" w:type="dxa"/>
               <w:right w:w="80" w:type="dxa"/>
             </w:tcMar>
-            <w:shd w:fill="F8FAFC"/>
           </w:tcPr>
           <w:p>
             <w:r>
@@ -2008,13 +2008,13 @@
         <w:tc>
           <w:tcPr>
             <w:tcW w:type="dxa" w:w="1680"/>
+            <w:shd w:fill="F8FAFC"/>
             <w:tcMar>
               <w:top w:w="60" w:type="dxa"/>
               <w:bottom w:w="60" w:type="dxa"/>
               <w:left w:w="80" w:type="dxa"/>
               <w:right w:w="80" w:type="dxa"/>
             </w:tcMar>
-            <w:shd w:fill="F8FAFC"/>
           </w:tcPr>
           <w:p>
             <w:r>
@@ -2028,13 +2028,13 @@
         <w:tc>
           <w:tcPr>
             <w:tcW w:type="dxa" w:w="1680"/>
+            <w:shd w:fill="F8FAFC"/>
             <w:tcMar>
               <w:top w:w="60" w:type="dxa"/>
               <w:bottom w:w="60" w:type="dxa"/>
               <w:left w:w="80" w:type="dxa"/>
               <w:right w:w="80" w:type="dxa"/>
             </w:tcMar>
-            <w:shd w:fill="F8FAFC"/>
           </w:tcPr>
           <w:p>
             <w:r>
@@ -2048,13 +2048,13 @@
         <w:tc>
           <w:tcPr>
             <w:tcW w:type="dxa" w:w="1680"/>
+            <w:shd w:fill="F8FAFC"/>
             <w:tcMar>
               <w:top w:w="60" w:type="dxa"/>
               <w:bottom w:w="60" w:type="dxa"/>
               <w:left w:w="80" w:type="dxa"/>
               <w:right w:w="80" w:type="dxa"/>
             </w:tcMar>
-            <w:shd w:fill="F8FAFC"/>
           </w:tcPr>
           <w:p>
             <w:r>
@@ -2068,13 +2068,13 @@
         <w:tc>
           <w:tcPr>
             <w:tcW w:type="dxa" w:w="1680"/>
+            <w:shd w:fill="F8FAFC"/>
             <w:tcMar>
               <w:top w:w="60" w:type="dxa"/>
               <w:bottom w:w="60" w:type="dxa"/>
               <w:left w:w="80" w:type="dxa"/>
               <w:right w:w="80" w:type="dxa"/>
             </w:tcMar>
-            <w:shd w:fill="F8FAFC"/>
           </w:tcPr>
           <w:p>
             <w:r>
@@ -2088,13 +2088,13 @@
         <w:tc>
           <w:tcPr>
             <w:tcW w:type="dxa" w:w="1680"/>
+            <w:shd w:fill="F8FAFC"/>
             <w:tcMar>
               <w:top w:w="60" w:type="dxa"/>
               <w:bottom w:w="60" w:type="dxa"/>
               <w:left w:w="80" w:type="dxa"/>
               <w:right w:w="80" w:type="dxa"/>
             </w:tcMar>
-            <w:shd w:fill="F8FAFC"/>
           </w:tcPr>
           <w:p>
             <w:r>
@@ -2226,13 +2226,13 @@
         <w:tc>
           <w:tcPr>
             <w:tcW w:type="dxa" w:w="1680"/>
+            <w:shd w:fill="F8FAFC"/>
             <w:tcMar>
               <w:top w:w="60" w:type="dxa"/>
               <w:bottom w:w="60" w:type="dxa"/>
               <w:left w:w="80" w:type="dxa"/>
               <w:right w:w="80" w:type="dxa"/>
             </w:tcMar>
-            <w:shd w:fill="F8FAFC"/>
           </w:tcPr>
           <w:p>
             <w:r>
@@ -2246,13 +2246,13 @@
         <w:tc>
           <w:tcPr>
             <w:tcW w:type="dxa" w:w="1680"/>
+            <w:shd w:fill="F8FAFC"/>
             <w:tcMar>
               <w:top w:w="60" w:type="dxa"/>
               <w:bottom w:w="60" w:type="dxa"/>
               <w:left w:w="80" w:type="dxa"/>
               <w:right w:w="80" w:type="dxa"/>
             </w:tcMar>
-            <w:shd w:fill="F8FAFC"/>
           </w:tcPr>
           <w:p>
             <w:r>
@@ -2266,13 +2266,13 @@
         <w:tc>
           <w:tcPr>
             <w:tcW w:type="dxa" w:w="1680"/>
+            <w:shd w:fill="F8FAFC"/>
             <w:tcMar>
               <w:top w:w="60" w:type="dxa"/>
               <w:bottom w:w="60" w:type="dxa"/>
               <w:left w:w="80" w:type="dxa"/>
               <w:right w:w="80" w:type="dxa"/>
             </w:tcMar>
-            <w:shd w:fill="F8FAFC"/>
           </w:tcPr>
           <w:p>
             <w:r>
@@ -2286,13 +2286,13 @@
         <w:tc>
           <w:tcPr>
             <w:tcW w:type="dxa" w:w="1680"/>
+            <w:shd w:fill="F8FAFC"/>
             <w:tcMar>
               <w:top w:w="60" w:type="dxa"/>
               <w:bottom w:w="60" w:type="dxa"/>
               <w:left w:w="80" w:type="dxa"/>
               <w:right w:w="80" w:type="dxa"/>
             </w:tcMar>
-            <w:shd w:fill="F8FAFC"/>
           </w:tcPr>
           <w:p>
             <w:r>
@@ -2306,13 +2306,13 @@
         <w:tc>
           <w:tcPr>
             <w:tcW w:type="dxa" w:w="1680"/>
+            <w:shd w:fill="F8FAFC"/>
             <w:tcMar>
               <w:top w:w="60" w:type="dxa"/>
               <w:bottom w:w="60" w:type="dxa"/>
               <w:left w:w="80" w:type="dxa"/>
               <w:right w:w="80" w:type="dxa"/>
             </w:tcMar>
-            <w:shd w:fill="F8FAFC"/>
           </w:tcPr>
           <w:p>
             <w:r>
@@ -2326,13 +2326,13 @@
         <w:tc>
           <w:tcPr>
             <w:tcW w:type="dxa" w:w="1680"/>
+            <w:shd w:fill="F8FAFC"/>
             <w:tcMar>
               <w:top w:w="60" w:type="dxa"/>
               <w:bottom w:w="60" w:type="dxa"/>
               <w:left w:w="80" w:type="dxa"/>
               <w:right w:w="80" w:type="dxa"/>
             </w:tcMar>
-            <w:shd w:fill="F8FAFC"/>
           </w:tcPr>
           <w:p>
             <w:r>
@@ -2464,13 +2464,13 @@
         <w:tc>
           <w:tcPr>
             <w:tcW w:type="dxa" w:w="1680"/>
+            <w:shd w:fill="F8FAFC"/>
             <w:tcMar>
               <w:top w:w="60" w:type="dxa"/>
               <w:bottom w:w="60" w:type="dxa"/>
               <w:left w:w="80" w:type="dxa"/>
               <w:right w:w="80" w:type="dxa"/>
             </w:tcMar>
-            <w:shd w:fill="F8FAFC"/>
           </w:tcPr>
           <w:p>
             <w:r>
@@ -2484,13 +2484,13 @@
         <w:tc>
           <w:tcPr>
             <w:tcW w:type="dxa" w:w="1680"/>
+            <w:shd w:fill="F8FAFC"/>
             <w:tcMar>
               <w:top w:w="60" w:type="dxa"/>
               <w:bottom w:w="60" w:type="dxa"/>
               <w:left w:w="80" w:type="dxa"/>
               <w:right w:w="80" w:type="dxa"/>
             </w:tcMar>
-            <w:shd w:fill="F8FAFC"/>
           </w:tcPr>
           <w:p>
             <w:r>
@@ -2504,13 +2504,13 @@
         <w:tc>
           <w:tcPr>
             <w:tcW w:type="dxa" w:w="1680"/>
+            <w:shd w:fill="F8FAFC"/>
             <w:tcMar>
               <w:top w:w="60" w:type="dxa"/>
               <w:bottom w:w="60" w:type="dxa"/>
               <w:left w:w="80" w:type="dxa"/>
               <w:right w:w="80" w:type="dxa"/>
             </w:tcMar>
-            <w:shd w:fill="F8FAFC"/>
           </w:tcPr>
           <w:p>
             <w:r>
@@ -2524,13 +2524,13 @@
         <w:tc>
           <w:tcPr>
             <w:tcW w:type="dxa" w:w="1680"/>
+            <w:shd w:fill="F8FAFC"/>
             <w:tcMar>
               <w:top w:w="60" w:type="dxa"/>
               <w:bottom w:w="60" w:type="dxa"/>
               <w:left w:w="80" w:type="dxa"/>
               <w:right w:w="80" w:type="dxa"/>
             </w:tcMar>
-            <w:shd w:fill="F8FAFC"/>
           </w:tcPr>
           <w:p>
             <w:r>
@@ -2544,13 +2544,13 @@
         <w:tc>
           <w:tcPr>
             <w:tcW w:type="dxa" w:w="1680"/>
+            <w:shd w:fill="F8FAFC"/>
             <w:tcMar>
               <w:top w:w="60" w:type="dxa"/>
               <w:bottom w:w="60" w:type="dxa"/>
               <w:left w:w="80" w:type="dxa"/>
               <w:right w:w="80" w:type="dxa"/>
             </w:tcMar>
-            <w:shd w:fill="F8FAFC"/>
           </w:tcPr>
           <w:p>
             <w:r>
@@ -2564,13 +2564,13 @@
         <w:tc>
           <w:tcPr>
             <w:tcW w:type="dxa" w:w="1680"/>
+            <w:shd w:fill="F8FAFC"/>
             <w:tcMar>
               <w:top w:w="60" w:type="dxa"/>
               <w:bottom w:w="60" w:type="dxa"/>
               <w:left w:w="80" w:type="dxa"/>
               <w:right w:w="80" w:type="dxa"/>
             </w:tcMar>
-            <w:shd w:fill="F8FAFC"/>
           </w:tcPr>
           <w:p>
             <w:r>
@@ -2702,13 +2702,13 @@
         <w:tc>
           <w:tcPr>
             <w:tcW w:type="dxa" w:w="1680"/>
+            <w:shd w:fill="F8FAFC"/>
             <w:tcMar>
               <w:top w:w="60" w:type="dxa"/>
               <w:bottom w:w="60" w:type="dxa"/>
               <w:left w:w="80" w:type="dxa"/>
               <w:right w:w="80" w:type="dxa"/>
             </w:tcMar>
-            <w:shd w:fill="F8FAFC"/>
           </w:tcPr>
           <w:p>
             <w:r>
@@ -2722,13 +2722,13 @@
         <w:tc>
           <w:tcPr>
             <w:tcW w:type="dxa" w:w="1680"/>
+            <w:shd w:fill="F8FAFC"/>
             <w:tcMar>
               <w:top w:w="60" w:type="dxa"/>
               <w:bottom w:w="60" w:type="dxa"/>
               <w:left w:w="80" w:type="dxa"/>
               <w:right w:w="80" w:type="dxa"/>
             </w:tcMar>
-            <w:shd w:fill="F8FAFC"/>
           </w:tcPr>
           <w:p>
             <w:r>
@@ -2742,13 +2742,13 @@
         <w:tc>
           <w:tcPr>
             <w:tcW w:type="dxa" w:w="1680"/>
+            <w:shd w:fill="F8FAFC"/>
             <w:tcMar>
               <w:top w:w="60" w:type="dxa"/>
               <w:bottom w:w="60" w:type="dxa"/>
               <w:left w:w="80" w:type="dxa"/>
               <w:right w:w="80" w:type="dxa"/>
             </w:tcMar>
-            <w:shd w:fill="F8FAFC"/>
           </w:tcPr>
           <w:p>
             <w:r>
@@ -2762,13 +2762,13 @@
         <w:tc>
           <w:tcPr>
             <w:tcW w:type="dxa" w:w="1680"/>
+            <w:shd w:fill="F8FAFC"/>
             <w:tcMar>
               <w:top w:w="60" w:type="dxa"/>
               <w:bottom w:w="60" w:type="dxa"/>
               <w:left w:w="80" w:type="dxa"/>
               <w:right w:w="80" w:type="dxa"/>
             </w:tcMar>
-            <w:shd w:fill="F8FAFC"/>
           </w:tcPr>
           <w:p>
             <w:r>
@@ -2782,13 +2782,13 @@
         <w:tc>
           <w:tcPr>
             <w:tcW w:type="dxa" w:w="1680"/>
+            <w:shd w:fill="F8FAFC"/>
             <w:tcMar>
               <w:top w:w="60" w:type="dxa"/>
               <w:bottom w:w="60" w:type="dxa"/>
               <w:left w:w="80" w:type="dxa"/>
               <w:right w:w="80" w:type="dxa"/>
             </w:tcMar>
-            <w:shd w:fill="F8FAFC"/>
           </w:tcPr>
           <w:p>
             <w:r>
@@ -2802,13 +2802,13 @@
         <w:tc>
           <w:tcPr>
             <w:tcW w:type="dxa" w:w="1680"/>
+            <w:shd w:fill="F8FAFC"/>
             <w:tcMar>
               <w:top w:w="60" w:type="dxa"/>
               <w:bottom w:w="60" w:type="dxa"/>
               <w:left w:w="80" w:type="dxa"/>
               <w:right w:w="80" w:type="dxa"/>
             </w:tcMar>
-            <w:shd w:fill="F8FAFC"/>
           </w:tcPr>
           <w:p>
             <w:r>
@@ -2940,13 +2940,13 @@
         <w:tc>
           <w:tcPr>
             <w:tcW w:type="dxa" w:w="1680"/>
+            <w:shd w:fill="F8FAFC"/>
             <w:tcMar>
               <w:top w:w="60" w:type="dxa"/>
               <w:bottom w:w="60" w:type="dxa"/>
               <w:left w:w="80" w:type="dxa"/>
               <w:right w:w="80" w:type="dxa"/>
             </w:tcMar>
-            <w:shd w:fill="F8FAFC"/>
           </w:tcPr>
           <w:p>
             <w:r>
@@ -2960,13 +2960,13 @@
         <w:tc>
           <w:tcPr>
             <w:tcW w:type="dxa" w:w="1680"/>
+            <w:shd w:fill="F8FAFC"/>
             <w:tcMar>
               <w:top w:w="60" w:type="dxa"/>
               <w:bottom w:w="60" w:type="dxa"/>
               <w:left w:w="80" w:type="dxa"/>
               <w:right w:w="80" w:type="dxa"/>
             </w:tcMar>
-            <w:shd w:fill="F8FAFC"/>
           </w:tcPr>
           <w:p>
             <w:r>
@@ -2980,13 +2980,13 @@
         <w:tc>
           <w:tcPr>
             <w:tcW w:type="dxa" w:w="1680"/>
+            <w:shd w:fill="F8FAFC"/>
             <w:tcMar>
               <w:top w:w="60" w:type="dxa"/>
               <w:bottom w:w="60" w:type="dxa"/>
               <w:left w:w="80" w:type="dxa"/>
               <w:right w:w="80" w:type="dxa"/>
             </w:tcMar>
-            <w:shd w:fill="F8FAFC"/>
           </w:tcPr>
           <w:p>
             <w:r>
@@ -3000,13 +3000,13 @@
         <w:tc>
           <w:tcPr>
             <w:tcW w:type="dxa" w:w="1680"/>
+            <w:shd w:fill="F8FAFC"/>
             <w:tcMar>
               <w:top w:w="60" w:type="dxa"/>
               <w:bottom w:w="60" w:type="dxa"/>
               <w:left w:w="80" w:type="dxa"/>
               <w:right w:w="80" w:type="dxa"/>
             </w:tcMar>
-            <w:shd w:fill="F8FAFC"/>
           </w:tcPr>
           <w:p>
             <w:r>
@@ -3020,13 +3020,13 @@
         <w:tc>
           <w:tcPr>
             <w:tcW w:type="dxa" w:w="1680"/>
+            <w:shd w:fill="F8FAFC"/>
             <w:tcMar>
               <w:top w:w="60" w:type="dxa"/>
               <w:bottom w:w="60" w:type="dxa"/>
               <w:left w:w="80" w:type="dxa"/>
               <w:right w:w="80" w:type="dxa"/>
             </w:tcMar>
-            <w:shd w:fill="F8FAFC"/>
           </w:tcPr>
           <w:p>
             <w:r>
@@ -3040,13 +3040,13 @@
         <w:tc>
           <w:tcPr>
             <w:tcW w:type="dxa" w:w="1680"/>
+            <w:shd w:fill="F8FAFC"/>
             <w:tcMar>
               <w:top w:w="60" w:type="dxa"/>
               <w:bottom w:w="60" w:type="dxa"/>
               <w:left w:w="80" w:type="dxa"/>
               <w:right w:w="80" w:type="dxa"/>
             </w:tcMar>
-            <w:shd w:fill="F8FAFC"/>
           </w:tcPr>
           <w:p>
             <w:r>
@@ -3178,13 +3178,13 @@
         <w:tc>
           <w:tcPr>
             <w:tcW w:type="dxa" w:w="1680"/>
+            <w:shd w:fill="F8FAFC"/>
             <w:tcMar>
               <w:top w:w="60" w:type="dxa"/>
               <w:bottom w:w="60" w:type="dxa"/>
               <w:left w:w="80" w:type="dxa"/>
               <w:right w:w="80" w:type="dxa"/>
             </w:tcMar>
-            <w:shd w:fill="F8FAFC"/>
           </w:tcPr>
           <w:p>
             <w:r>
@@ -3198,13 +3198,13 @@
         <w:tc>
           <w:tcPr>
             <w:tcW w:type="dxa" w:w="1680"/>
+            <w:shd w:fill="F8FAFC"/>
             <w:tcMar>
               <w:top w:w="60" w:type="dxa"/>
               <w:bottom w:w="60" w:type="dxa"/>
               <w:left w:w="80" w:type="dxa"/>
               <w:right w:w="80" w:type="dxa"/>
             </w:tcMar>
-            <w:shd w:fill="F8FAFC"/>
           </w:tcPr>
           <w:p>
             <w:r>
@@ -3218,13 +3218,13 @@
         <w:tc>
           <w:tcPr>
             <w:tcW w:type="dxa" w:w="1680"/>
+            <w:shd w:fill="F8FAFC"/>
             <w:tcMar>
               <w:top w:w="60" w:type="dxa"/>
               <w:bottom w:w="60" w:type="dxa"/>
               <w:left w:w="80" w:type="dxa"/>
               <w:right w:w="80" w:type="dxa"/>
             </w:tcMar>
-            <w:shd w:fill="F8FAFC"/>
           </w:tcPr>
           <w:p>
             <w:r>
@@ -3238,13 +3238,13 @@
         <w:tc>
           <w:tcPr>
             <w:tcW w:type="dxa" w:w="1680"/>
+            <w:shd w:fill="F8FAFC"/>
             <w:tcMar>
               <w:top w:w="60" w:type="dxa"/>
               <w:bottom w:w="60" w:type="dxa"/>
               <w:left w:w="80" w:type="dxa"/>
               <w:right w:w="80" w:type="dxa"/>
             </w:tcMar>
-            <w:shd w:fill="F8FAFC"/>
           </w:tcPr>
           <w:p>
             <w:r>
@@ -3258,13 +3258,13 @@
         <w:tc>
           <w:tcPr>
             <w:tcW w:type="dxa" w:w="1680"/>
+            <w:shd w:fill="F8FAFC"/>
             <w:tcMar>
               <w:top w:w="60" w:type="dxa"/>
               <w:bottom w:w="60" w:type="dxa"/>
               <w:left w:w="80" w:type="dxa"/>
               <w:right w:w="80" w:type="dxa"/>
             </w:tcMar>
-            <w:shd w:fill="F8FAFC"/>
           </w:tcPr>
           <w:p>
             <w:r>
@@ -3278,13 +3278,13 @@
         <w:tc>
           <w:tcPr>
             <w:tcW w:type="dxa" w:w="1680"/>
+            <w:shd w:fill="F8FAFC"/>
             <w:tcMar>
               <w:top w:w="60" w:type="dxa"/>
               <w:bottom w:w="60" w:type="dxa"/>
               <w:left w:w="80" w:type="dxa"/>
               <w:right w:w="80" w:type="dxa"/>
             </w:tcMar>
-            <w:shd w:fill="F8FAFC"/>
           </w:tcPr>
           <w:p>
             <w:r>
@@ -3564,7 +3564,6 @@
       <w:tblPr>
         <w:tblW w:type="auto" w:w="0"/>
         <w:jc w:val="center"/>
-        <w:tblLook w:firstColumn="1" w:firstRow="1" w:lastColumn="0" w:lastRow="0" w:noHBand="0" w:noVBand="1" w:val="04A0"/>
         <w:tblBorders>
           <w:top w:val="single" w:sz="4" w:space="0" w:color="CBD5E1"/>
           <w:bottom w:val="single" w:sz="4" w:space="0" w:color="CBD5E1"/>
@@ -3573,6 +3572,7 @@
           <w:insideH w:val="single" w:sz="4" w:space="0" w:color="CBD5E1"/>
           <w:insideV w:val="none"/>
         </w:tblBorders>
+        <w:tblLook w:firstColumn="1" w:firstRow="1" w:lastColumn="0" w:lastRow="0" w:noHBand="0" w:noVBand="1" w:val="04A0"/>
       </w:tblPr>
       <w:tblGrid>
         <w:gridCol w:w="2160"/>
@@ -3674,13 +3674,13 @@
         <w:tc>
           <w:tcPr>
             <w:tcW w:type="dxa" w:w="2520"/>
+            <w:shd w:fill="F8FAFC"/>
             <w:tcMar>
               <w:top w:w="60" w:type="dxa"/>
               <w:bottom w:w="60" w:type="dxa"/>
               <w:left w:w="80" w:type="dxa"/>
               <w:right w:w="80" w:type="dxa"/>
             </w:tcMar>
-            <w:shd w:fill="F8FAFC"/>
           </w:tcPr>
           <w:p>
             <w:r>
@@ -3694,13 +3694,13 @@
         <w:tc>
           <w:tcPr>
             <w:tcW w:type="dxa" w:w="2520"/>
+            <w:shd w:fill="F8FAFC"/>
             <w:tcMar>
               <w:top w:w="60" w:type="dxa"/>
               <w:bottom w:w="60" w:type="dxa"/>
               <w:left w:w="80" w:type="dxa"/>
               <w:right w:w="80" w:type="dxa"/>
             </w:tcMar>
-            <w:shd w:fill="F8FAFC"/>
           </w:tcPr>
           <w:p>
             <w:r>
@@ -3714,13 +3714,13 @@
         <w:tc>
           <w:tcPr>
             <w:tcW w:type="dxa" w:w="2520"/>
+            <w:shd w:fill="F8FAFC"/>
             <w:tcMar>
               <w:top w:w="60" w:type="dxa"/>
               <w:bottom w:w="60" w:type="dxa"/>
               <w:left w:w="80" w:type="dxa"/>
               <w:right w:w="80" w:type="dxa"/>
             </w:tcMar>
-            <w:shd w:fill="F8FAFC"/>
           </w:tcPr>
           <w:p>
             <w:r>
@@ -3734,13 +3734,13 @@
         <w:tc>
           <w:tcPr>
             <w:tcW w:type="dxa" w:w="2520"/>
+            <w:shd w:fill="F8FAFC"/>
             <w:tcMar>
               <w:top w:w="60" w:type="dxa"/>
               <w:bottom w:w="60" w:type="dxa"/>
               <w:left w:w="80" w:type="dxa"/>
               <w:right w:w="80" w:type="dxa"/>
             </w:tcMar>
-            <w:shd w:fill="F8FAFC"/>
           </w:tcPr>
           <w:p>
             <w:r>
@@ -3834,13 +3834,13 @@
         <w:tc>
           <w:tcPr>
             <w:tcW w:type="dxa" w:w="2520"/>
+            <w:shd w:fill="F8FAFC"/>
             <w:tcMar>
               <w:top w:w="60" w:type="dxa"/>
               <w:bottom w:w="60" w:type="dxa"/>
               <w:left w:w="80" w:type="dxa"/>
               <w:right w:w="80" w:type="dxa"/>
             </w:tcMar>
-            <w:shd w:fill="F8FAFC"/>
           </w:tcPr>
           <w:p>
             <w:r>
@@ -3854,13 +3854,13 @@
         <w:tc>
           <w:tcPr>
             <w:tcW w:type="dxa" w:w="2520"/>
+            <w:shd w:fill="F8FAFC"/>
             <w:tcMar>
               <w:top w:w="60" w:type="dxa"/>
               <w:bottom w:w="60" w:type="dxa"/>
               <w:left w:w="80" w:type="dxa"/>
               <w:right w:w="80" w:type="dxa"/>
             </w:tcMar>
-            <w:shd w:fill="F8FAFC"/>
           </w:tcPr>
           <w:p>
             <w:r>
@@ -3874,13 +3874,13 @@
         <w:tc>
           <w:tcPr>
             <w:tcW w:type="dxa" w:w="2520"/>
+            <w:shd w:fill="F8FAFC"/>
             <w:tcMar>
               <w:top w:w="60" w:type="dxa"/>
               <w:bottom w:w="60" w:type="dxa"/>
               <w:left w:w="80" w:type="dxa"/>
               <w:right w:w="80" w:type="dxa"/>
             </w:tcMar>
-            <w:shd w:fill="F8FAFC"/>
           </w:tcPr>
           <w:p>
             <w:r>
@@ -3894,13 +3894,13 @@
         <w:tc>
           <w:tcPr>
             <w:tcW w:type="dxa" w:w="2520"/>
+            <w:shd w:fill="F8FAFC"/>
             <w:tcMar>
               <w:top w:w="60" w:type="dxa"/>
               <w:bottom w:w="60" w:type="dxa"/>
               <w:left w:w="80" w:type="dxa"/>
               <w:right w:w="80" w:type="dxa"/>
             </w:tcMar>
-            <w:shd w:fill="F8FAFC"/>
           </w:tcPr>
           <w:p>
             <w:r>
@@ -3994,13 +3994,13 @@
         <w:tc>
           <w:tcPr>
             <w:tcW w:type="dxa" w:w="2520"/>
+            <w:shd w:fill="F8FAFC"/>
             <w:tcMar>
               <w:top w:w="60" w:type="dxa"/>
               <w:bottom w:w="60" w:type="dxa"/>
               <w:left w:w="80" w:type="dxa"/>
               <w:right w:w="80" w:type="dxa"/>
             </w:tcMar>
-            <w:shd w:fill="F8FAFC"/>
           </w:tcPr>
           <w:p>
             <w:r>
@@ -4014,13 +4014,13 @@
         <w:tc>
           <w:tcPr>
             <w:tcW w:type="dxa" w:w="2520"/>
+            <w:shd w:fill="F8FAFC"/>
             <w:tcMar>
               <w:top w:w="60" w:type="dxa"/>
               <w:bottom w:w="60" w:type="dxa"/>
               <w:left w:w="80" w:type="dxa"/>
               <w:right w:w="80" w:type="dxa"/>
             </w:tcMar>
-            <w:shd w:fill="F8FAFC"/>
           </w:tcPr>
           <w:p>
             <w:r>
@@ -4034,13 +4034,13 @@
         <w:tc>
           <w:tcPr>
             <w:tcW w:type="dxa" w:w="2520"/>
+            <w:shd w:fill="F8FAFC"/>
             <w:tcMar>
               <w:top w:w="60" w:type="dxa"/>
               <w:bottom w:w="60" w:type="dxa"/>
               <w:left w:w="80" w:type="dxa"/>
               <w:right w:w="80" w:type="dxa"/>
             </w:tcMar>
-            <w:shd w:fill="F8FAFC"/>
           </w:tcPr>
           <w:p>
             <w:r>
@@ -4054,13 +4054,13 @@
         <w:tc>
           <w:tcPr>
             <w:tcW w:type="dxa" w:w="2520"/>
+            <w:shd w:fill="F8FAFC"/>
             <w:tcMar>
               <w:top w:w="60" w:type="dxa"/>
               <w:bottom w:w="60" w:type="dxa"/>
               <w:left w:w="80" w:type="dxa"/>
               <w:right w:w="80" w:type="dxa"/>
             </w:tcMar>
-            <w:shd w:fill="F8FAFC"/>
           </w:tcPr>
           <w:p>
             <w:r>
@@ -4217,7 +4217,6 @@
       <w:tblPr>
         <w:tblW w:type="auto" w:w="0"/>
         <w:jc w:val="center"/>
-        <w:tblLook w:firstColumn="1" w:firstRow="1" w:lastColumn="0" w:lastRow="0" w:noHBand="0" w:noVBand="1" w:val="04A0"/>
         <w:tblBorders>
           <w:top w:val="single" w:sz="4" w:space="0" w:color="CBD5E1"/>
           <w:bottom w:val="single" w:sz="4" w:space="0" w:color="CBD5E1"/>
@@ -4226,6 +4225,7 @@
           <w:insideH w:val="single" w:sz="4" w:space="0" w:color="CBD5E1"/>
           <w:insideV w:val="none"/>
         </w:tblBorders>
+        <w:tblLook w:firstColumn="1" w:firstRow="1" w:lastColumn="0" w:lastRow="0" w:noHBand="0" w:noVBand="1" w:val="04A0"/>
       </w:tblPr>
       <w:tblGrid>
         <w:gridCol w:w="3168"/>
@@ -4304,13 +4304,13 @@
         <w:tc>
           <w:tcPr>
             <w:tcW w:type="dxa" w:w="3360"/>
+            <w:shd w:fill="F8FAFC"/>
             <w:tcMar>
               <w:top w:w="60" w:type="dxa"/>
               <w:bottom w:w="60" w:type="dxa"/>
               <w:left w:w="80" w:type="dxa"/>
               <w:right w:w="80" w:type="dxa"/>
             </w:tcMar>
-            <w:shd w:fill="F8FAFC"/>
           </w:tcPr>
           <w:p>
             <w:r>
@@ -4324,13 +4324,13 @@
         <w:tc>
           <w:tcPr>
             <w:tcW w:type="dxa" w:w="3360"/>
+            <w:shd w:fill="F8FAFC"/>
             <w:tcMar>
               <w:top w:w="60" w:type="dxa"/>
               <w:bottom w:w="60" w:type="dxa"/>
               <w:left w:w="80" w:type="dxa"/>
               <w:right w:w="80" w:type="dxa"/>
             </w:tcMar>
-            <w:shd w:fill="F8FAFC"/>
           </w:tcPr>
           <w:p>
             <w:r>
@@ -4344,13 +4344,13 @@
         <w:tc>
           <w:tcPr>
             <w:tcW w:type="dxa" w:w="3360"/>
+            <w:shd w:fill="F8FAFC"/>
             <w:tcMar>
               <w:top w:w="60" w:type="dxa"/>
               <w:bottom w:w="60" w:type="dxa"/>
               <w:left w:w="80" w:type="dxa"/>
               <w:right w:w="80" w:type="dxa"/>
             </w:tcMar>
-            <w:shd w:fill="F8FAFC"/>
           </w:tcPr>
           <w:p>
             <w:r>
@@ -4425,13 +4425,13 @@
         <w:tc>
           <w:tcPr>
             <w:tcW w:type="dxa" w:w="3360"/>
+            <w:shd w:fill="F8FAFC"/>
             <w:tcMar>
               <w:top w:w="60" w:type="dxa"/>
               <w:bottom w:w="60" w:type="dxa"/>
               <w:left w:w="80" w:type="dxa"/>
               <w:right w:w="80" w:type="dxa"/>
             </w:tcMar>
-            <w:shd w:fill="F8FAFC"/>
           </w:tcPr>
           <w:p>
             <w:r>
@@ -4445,13 +4445,13 @@
         <w:tc>
           <w:tcPr>
             <w:tcW w:type="dxa" w:w="3360"/>
+            <w:shd w:fill="F8FAFC"/>
             <w:tcMar>
               <w:top w:w="60" w:type="dxa"/>
               <w:bottom w:w="60" w:type="dxa"/>
               <w:left w:w="80" w:type="dxa"/>
               <w:right w:w="80" w:type="dxa"/>
             </w:tcMar>
-            <w:shd w:fill="F8FAFC"/>
           </w:tcPr>
           <w:p>
             <w:r>
@@ -4465,13 +4465,13 @@
         <w:tc>
           <w:tcPr>
             <w:tcW w:type="dxa" w:w="3360"/>
+            <w:shd w:fill="F8FAFC"/>
             <w:tcMar>
               <w:top w:w="60" w:type="dxa"/>
               <w:bottom w:w="60" w:type="dxa"/>
               <w:left w:w="80" w:type="dxa"/>
               <w:right w:w="80" w:type="dxa"/>
             </w:tcMar>
-            <w:shd w:fill="F8FAFC"/>
           </w:tcPr>
           <w:p>
             <w:r>
@@ -4562,7 +4562,6 @@
       <w:tblPr>
         <w:tblW w:type="auto" w:w="0"/>
         <w:jc w:val="center"/>
-        <w:tblLook w:firstColumn="1" w:firstRow="1" w:lastColumn="0" w:lastRow="0" w:noHBand="0" w:noVBand="1" w:val="04A0"/>
         <w:tblBorders>
           <w:top w:val="single" w:sz="4" w:space="0" w:color="CBD5E1"/>
           <w:bottom w:val="single" w:sz="4" w:space="0" w:color="CBD5E1"/>
@@ -4571,6 +4570,7 @@
           <w:insideH w:val="single" w:sz="4" w:space="0" w:color="CBD5E1"/>
           <w:insideV w:val="none"/>
         </w:tblBorders>
+        <w:tblLook w:firstColumn="1" w:firstRow="1" w:lastColumn="0" w:lastRow="0" w:noHBand="0" w:noVBand="1" w:val="04A0"/>
       </w:tblPr>
       <w:tblGrid>
         <w:gridCol w:w="2880"/>
@@ -4649,13 +4649,13 @@
         <w:tc>
           <w:tcPr>
             <w:tcW w:type="dxa" w:w="3360"/>
+            <w:shd w:fill="F8FAFC"/>
             <w:tcMar>
               <w:top w:w="60" w:type="dxa"/>
               <w:bottom w:w="60" w:type="dxa"/>
               <w:left w:w="80" w:type="dxa"/>
               <w:right w:w="80" w:type="dxa"/>
             </w:tcMar>
-            <w:shd w:fill="F8FAFC"/>
           </w:tcPr>
           <w:p>
             <w:r>
@@ -4669,13 +4669,13 @@
         <w:tc>
           <w:tcPr>
             <w:tcW w:type="dxa" w:w="3360"/>
+            <w:shd w:fill="F8FAFC"/>
             <w:tcMar>
               <w:top w:w="60" w:type="dxa"/>
               <w:bottom w:w="60" w:type="dxa"/>
               <w:left w:w="80" w:type="dxa"/>
               <w:right w:w="80" w:type="dxa"/>
             </w:tcMar>
-            <w:shd w:fill="F8FAFC"/>
           </w:tcPr>
           <w:p>
             <w:r>
@@ -4689,13 +4689,13 @@
         <w:tc>
           <w:tcPr>
             <w:tcW w:type="dxa" w:w="3360"/>
+            <w:shd w:fill="F8FAFC"/>
             <w:tcMar>
               <w:top w:w="60" w:type="dxa"/>
               <w:bottom w:w="60" w:type="dxa"/>
               <w:left w:w="80" w:type="dxa"/>
               <w:right w:w="80" w:type="dxa"/>
             </w:tcMar>
-            <w:shd w:fill="F8FAFC"/>
           </w:tcPr>
           <w:p>
             <w:r>
@@ -4770,13 +4770,13 @@
         <w:tc>
           <w:tcPr>
             <w:tcW w:type="dxa" w:w="3360"/>
+            <w:shd w:fill="F8FAFC"/>
             <w:tcMar>
               <w:top w:w="60" w:type="dxa"/>
               <w:bottom w:w="60" w:type="dxa"/>
               <w:left w:w="80" w:type="dxa"/>
               <w:right w:w="80" w:type="dxa"/>
             </w:tcMar>
-            <w:shd w:fill="F8FAFC"/>
           </w:tcPr>
           <w:p>
             <w:r>
@@ -4790,13 +4790,13 @@
         <w:tc>
           <w:tcPr>
             <w:tcW w:type="dxa" w:w="3360"/>
+            <w:shd w:fill="F8FAFC"/>
             <w:tcMar>
               <w:top w:w="60" w:type="dxa"/>
               <w:bottom w:w="60" w:type="dxa"/>
               <w:left w:w="80" w:type="dxa"/>
               <w:right w:w="80" w:type="dxa"/>
             </w:tcMar>
-            <w:shd w:fill="F8FAFC"/>
           </w:tcPr>
           <w:p>
             <w:r>
@@ -4810,13 +4810,13 @@
         <w:tc>
           <w:tcPr>
             <w:tcW w:type="dxa" w:w="3360"/>
+            <w:shd w:fill="F8FAFC"/>
             <w:tcMar>
               <w:top w:w="60" w:type="dxa"/>
               <w:bottom w:w="60" w:type="dxa"/>
               <w:left w:w="80" w:type="dxa"/>
               <w:right w:w="80" w:type="dxa"/>
             </w:tcMar>
-            <w:shd w:fill="F8FAFC"/>
           </w:tcPr>
           <w:p>
             <w:r>
@@ -4891,13 +4891,13 @@
         <w:tc>
           <w:tcPr>
             <w:tcW w:type="dxa" w:w="3360"/>
+            <w:shd w:fill="F8FAFC"/>
             <w:tcMar>
               <w:top w:w="60" w:type="dxa"/>
               <w:bottom w:w="60" w:type="dxa"/>
               <w:left w:w="80" w:type="dxa"/>
               <w:right w:w="80" w:type="dxa"/>
             </w:tcMar>
-            <w:shd w:fill="F8FAFC"/>
           </w:tcPr>
           <w:p>
             <w:r>
@@ -4911,13 +4911,13 @@
         <w:tc>
           <w:tcPr>
             <w:tcW w:type="dxa" w:w="3360"/>
+            <w:shd w:fill="F8FAFC"/>
             <w:tcMar>
               <w:top w:w="60" w:type="dxa"/>
               <w:bottom w:w="60" w:type="dxa"/>
               <w:left w:w="80" w:type="dxa"/>
               <w:right w:w="80" w:type="dxa"/>
             </w:tcMar>
-            <w:shd w:fill="F8FAFC"/>
           </w:tcPr>
           <w:p>
             <w:r>
@@ -4931,13 +4931,13 @@
         <w:tc>
           <w:tcPr>
             <w:tcW w:type="dxa" w:w="3360"/>
+            <w:shd w:fill="F8FAFC"/>
             <w:tcMar>
               <w:top w:w="60" w:type="dxa"/>
               <w:bottom w:w="60" w:type="dxa"/>
               <w:left w:w="80" w:type="dxa"/>
               <w:right w:w="80" w:type="dxa"/>
             </w:tcMar>
-            <w:shd w:fill="F8FAFC"/>
           </w:tcPr>
           <w:p>
             <w:r>
@@ -5169,7 +5169,6 @@
       <w:tblPr>
         <w:tblW w:type="auto" w:w="0"/>
         <w:jc w:val="center"/>
-        <w:tblLook w:firstColumn="1" w:firstRow="1" w:lastColumn="0" w:lastRow="0" w:noHBand="0" w:noVBand="1" w:val="04A0"/>
         <w:tblBorders>
           <w:top w:val="single" w:sz="4" w:space="0" w:color="CBD5E1"/>
           <w:bottom w:val="single" w:sz="4" w:space="0" w:color="CBD5E1"/>
@@ -5178,6 +5177,7 @@
           <w:insideH w:val="single" w:sz="4" w:space="0" w:color="CBD5E1"/>
           <w:insideV w:val="none"/>
         </w:tblBorders>
+        <w:tblLook w:firstColumn="1" w:firstRow="1" w:lastColumn="0" w:lastRow="0" w:noHBand="0" w:noVBand="1" w:val="04A0"/>
       </w:tblPr>
       <w:tblGrid>
         <w:gridCol w:w="2592"/>
@@ -5279,13 +5279,13 @@
         <w:tc>
           <w:tcPr>
             <w:tcW w:type="dxa" w:w="2520"/>
+            <w:shd w:fill="F8FAFC"/>
             <w:tcMar>
               <w:top w:w="60" w:type="dxa"/>
               <w:bottom w:w="60" w:type="dxa"/>
               <w:left w:w="80" w:type="dxa"/>
               <w:right w:w="80" w:type="dxa"/>
             </w:tcMar>
-            <w:shd w:fill="F8FAFC"/>
           </w:tcPr>
           <w:p>
             <w:r>
@@ -5299,13 +5299,13 @@
         <w:tc>
           <w:tcPr>
             <w:tcW w:type="dxa" w:w="2520"/>
+            <w:shd w:fill="F8FAFC"/>
             <w:tcMar>
               <w:top w:w="60" w:type="dxa"/>
               <w:bottom w:w="60" w:type="dxa"/>
               <w:left w:w="80" w:type="dxa"/>
               <w:right w:w="80" w:type="dxa"/>
             </w:tcMar>
-            <w:shd w:fill="F8FAFC"/>
           </w:tcPr>
           <w:p>
             <w:r>
@@ -5319,13 +5319,13 @@
         <w:tc>
           <w:tcPr>
             <w:tcW w:type="dxa" w:w="2520"/>
+            <w:shd w:fill="F8FAFC"/>
             <w:tcMar>
               <w:top w:w="60" w:type="dxa"/>
               <w:bottom w:w="60" w:type="dxa"/>
               <w:left w:w="80" w:type="dxa"/>
               <w:right w:w="80" w:type="dxa"/>
             </w:tcMar>
-            <w:shd w:fill="F8FAFC"/>
           </w:tcPr>
           <w:p>
             <w:r>
@@ -5339,13 +5339,13 @@
         <w:tc>
           <w:tcPr>
             <w:tcW w:type="dxa" w:w="2520"/>
+            <w:shd w:fill="F8FAFC"/>
             <w:tcMar>
               <w:top w:w="60" w:type="dxa"/>
               <w:bottom w:w="60" w:type="dxa"/>
               <w:left w:w="80" w:type="dxa"/>
               <w:right w:w="80" w:type="dxa"/>
             </w:tcMar>
-            <w:shd w:fill="F8FAFC"/>
           </w:tcPr>
           <w:p>
             <w:r>
@@ -5439,13 +5439,13 @@
         <w:tc>
           <w:tcPr>
             <w:tcW w:type="dxa" w:w="2520"/>
+            <w:shd w:fill="F8FAFC"/>
             <w:tcMar>
               <w:top w:w="60" w:type="dxa"/>
               <w:bottom w:w="60" w:type="dxa"/>
               <w:left w:w="80" w:type="dxa"/>
               <w:right w:w="80" w:type="dxa"/>
             </w:tcMar>
-            <w:shd w:fill="F8FAFC"/>
           </w:tcPr>
           <w:p>
             <w:r>
@@ -5459,13 +5459,13 @@
         <w:tc>
           <w:tcPr>
             <w:tcW w:type="dxa" w:w="2520"/>
+            <w:shd w:fill="F8FAFC"/>
             <w:tcMar>
               <w:top w:w="60" w:type="dxa"/>
               <w:bottom w:w="60" w:type="dxa"/>
               <w:left w:w="80" w:type="dxa"/>
               <w:right w:w="80" w:type="dxa"/>
             </w:tcMar>
-            <w:shd w:fill="F8FAFC"/>
           </w:tcPr>
           <w:p>
             <w:r>
@@ -5479,13 +5479,13 @@
         <w:tc>
           <w:tcPr>
             <w:tcW w:type="dxa" w:w="2520"/>
+            <w:shd w:fill="F8FAFC"/>
             <w:tcMar>
               <w:top w:w="60" w:type="dxa"/>
               <w:bottom w:w="60" w:type="dxa"/>
               <w:left w:w="80" w:type="dxa"/>
               <w:right w:w="80" w:type="dxa"/>
             </w:tcMar>
-            <w:shd w:fill="F8FAFC"/>
           </w:tcPr>
           <w:p>
             <w:r>
@@ -5499,13 +5499,13 @@
         <w:tc>
           <w:tcPr>
             <w:tcW w:type="dxa" w:w="2520"/>
+            <w:shd w:fill="F8FAFC"/>
             <w:tcMar>
               <w:top w:w="60" w:type="dxa"/>
               <w:bottom w:w="60" w:type="dxa"/>
               <w:left w:w="80" w:type="dxa"/>
               <w:right w:w="80" w:type="dxa"/>
             </w:tcMar>
-            <w:shd w:fill="F8FAFC"/>
           </w:tcPr>
           <w:p>
             <w:r>
@@ -5599,13 +5599,13 @@
         <w:tc>
           <w:tcPr>
             <w:tcW w:type="dxa" w:w="2520"/>
+            <w:shd w:fill="F8FAFC"/>
             <w:tcMar>
               <w:top w:w="60" w:type="dxa"/>
               <w:bottom w:w="60" w:type="dxa"/>
               <w:left w:w="80" w:type="dxa"/>
               <w:right w:w="80" w:type="dxa"/>
             </w:tcMar>
-            <w:shd w:fill="F8FAFC"/>
           </w:tcPr>
           <w:p>
             <w:r>
@@ -5619,13 +5619,13 @@
         <w:tc>
           <w:tcPr>
             <w:tcW w:type="dxa" w:w="2520"/>
+            <w:shd w:fill="F8FAFC"/>
             <w:tcMar>
               <w:top w:w="60" w:type="dxa"/>
               <w:bottom w:w="60" w:type="dxa"/>
               <w:left w:w="80" w:type="dxa"/>
               <w:right w:w="80" w:type="dxa"/>
             </w:tcMar>
-            <w:shd w:fill="F8FAFC"/>
           </w:tcPr>
           <w:p>
             <w:r>
@@ -5639,13 +5639,13 @@
         <w:tc>
           <w:tcPr>
             <w:tcW w:type="dxa" w:w="2520"/>
+            <w:shd w:fill="F8FAFC"/>
             <w:tcMar>
               <w:top w:w="60" w:type="dxa"/>
               <w:bottom w:w="60" w:type="dxa"/>
               <w:left w:w="80" w:type="dxa"/>
               <w:right w:w="80" w:type="dxa"/>
             </w:tcMar>
-            <w:shd w:fill="F8FAFC"/>
           </w:tcPr>
           <w:p>
             <w:r>
@@ -5659,13 +5659,13 @@
         <w:tc>
           <w:tcPr>
             <w:tcW w:type="dxa" w:w="2520"/>
+            <w:shd w:fill="F8FAFC"/>
             <w:tcMar>
               <w:top w:w="60" w:type="dxa"/>
               <w:bottom w:w="60" w:type="dxa"/>
               <w:left w:w="80" w:type="dxa"/>
               <w:right w:w="80" w:type="dxa"/>
             </w:tcMar>
-            <w:shd w:fill="F8FAFC"/>
           </w:tcPr>
           <w:p>
             <w:r>

</xml_diff>